<commit_message>
updated responsive ui and added MediaQuery.removePadding()
</commit_message>
<xml_diff>
--- a/flutter_documents/f1_widgets_and_UI/f11_part_2_of_responsive_ui_and_packages.docx
+++ b/flutter_documents/f1_widgets_and_UI/f11_part_2_of_responsive_ui_and_packages.docx
@@ -266,17 +266,33 @@
           <w:sz w:val="32"/>
           <w:szCs w:val="32"/>
         </w:rPr>
-        <w:t xml:space="preserve">There is also an alternative package called </w:t>
-      </w:r>
-      <w:r>
-        <w:rPr>
-          <w:rFonts w:ascii="Carlito" w:hAnsi="Carlito" w:cs="Carlito"/>
-          <w:b/>
-          <w:bCs/>
-          <w:sz w:val="32"/>
-          <w:szCs w:val="32"/>
-        </w:rPr>
-        <w:t>sizer</w:t>
+        <w:t xml:space="preserve">There is an </w:t>
+      </w:r>
+      <w:r>
+        <w:rPr>
+          <w:rFonts w:ascii="Carlito" w:hAnsi="Carlito" w:cs="Carlito"/>
+          <w:sz w:val="32"/>
+          <w:szCs w:val="32"/>
+        </w:rPr>
+        <w:t>updated version of this</w:t>
+      </w:r>
+      <w:r>
+        <w:rPr>
+          <w:rFonts w:ascii="Carlito" w:hAnsi="Carlito" w:cs="Carlito"/>
+          <w:sz w:val="32"/>
+          <w:szCs w:val="32"/>
+        </w:rPr>
+        <w:t xml:space="preserve"> called </w:t>
+      </w:r>
+      <w:r>
+        <w:rPr>
+          <w:rFonts w:ascii="Carlito" w:hAnsi="Carlito" w:cs="Carlito"/>
+          <w:b/>
+          <w:bCs/>
+          <w:sz w:val="32"/>
+          <w:szCs w:val="32"/>
+        </w:rPr>
+        <w:t>flutter_screenutil_plus</w:t>
       </w:r>
       <w:r>
         <w:rPr>
@@ -289,10 +305,20 @@
       <w:r>
         <w:rPr>
           <w:rFonts w:ascii="Carlito" w:hAnsi="Carlito" w:cs="Carlito"/>
-          <w:sz w:val="32"/>
-          <w:szCs w:val="32"/>
-        </w:rPr>
-        <w:t xml:space="preserve"> To install or set up this </w:t>
+          <w:b/>
+          <w:bCs/>
+          <w:sz w:val="32"/>
+          <w:szCs w:val="32"/>
+        </w:rPr>
+        <w:t xml:space="preserve"> </w:t>
+      </w:r>
+      <w:r>
+        <w:rPr>
+          <w:rFonts w:ascii="Carlito" w:hAnsi="Carlito" w:cs="Carlito"/>
+          <w:sz w:val="32"/>
+          <w:szCs w:val="32"/>
+        </w:rPr>
+        <w:t xml:space="preserve">To install or set up this </w:t>
       </w:r>
       <w:r>
         <w:rPr>
@@ -540,7 +566,63 @@
           <w:sz w:val="32"/>
           <w:szCs w:val="32"/>
         </w:rPr>
-        <w:t xml:space="preserve"> before MaterialApp or wrapping MaterialApp.</w:t>
+        <w:t xml:space="preserve"> before </w:t>
+      </w:r>
+      <w:r>
+        <w:rPr>
+          <w:rFonts w:ascii="Carlito" w:hAnsi="Carlito" w:cs="Carlito"/>
+          <w:b/>
+          <w:bCs/>
+          <w:sz w:val="32"/>
+          <w:szCs w:val="32"/>
+        </w:rPr>
+        <w:t>MaterialApp</w:t>
+      </w:r>
+      <w:r>
+        <w:rPr>
+          <w:rFonts w:ascii="Carlito" w:hAnsi="Carlito" w:cs="Carlito"/>
+          <w:b/>
+          <w:bCs/>
+          <w:sz w:val="32"/>
+          <w:szCs w:val="32"/>
+        </w:rPr>
+        <w:t>()</w:t>
+      </w:r>
+      <w:r>
+        <w:rPr>
+          <w:rFonts w:ascii="Carlito" w:hAnsi="Carlito" w:cs="Carlito"/>
+          <w:sz w:val="32"/>
+          <w:szCs w:val="32"/>
+        </w:rPr>
+        <w:t xml:space="preserve"> or wrapping </w:t>
+      </w:r>
+      <w:r>
+        <w:rPr>
+          <w:rFonts w:ascii="Carlito" w:hAnsi="Carlito" w:cs="Carlito"/>
+          <w:b/>
+          <w:bCs/>
+          <w:sz w:val="32"/>
+          <w:szCs w:val="32"/>
+        </w:rPr>
+        <w:t>MaterialApp</w:t>
+      </w:r>
+      <w:r>
+        <w:rPr>
+          <w:rFonts w:ascii="Carlito" w:hAnsi="Carlito" w:cs="Carlito"/>
+          <w:b/>
+          <w:bCs/>
+          <w:sz w:val="32"/>
+          <w:szCs w:val="32"/>
+        </w:rPr>
+        <w:t>()</w:t>
+      </w:r>
+      <w:r>
+        <w:rPr>
+          <w:rFonts w:ascii="Carlito" w:hAnsi="Carlito" w:cs="Carlito"/>
+          <w:sz w:val="32"/>
+          <w:szCs w:val="32"/>
+        </w:rPr>
+        <w:t>.</w:t>
       </w:r>
     </w:p>
     <w:p>
@@ -1300,14 +1382,15 @@
     <w:tbl>
       <w:tblPr>
         <w:tblStyle w:val="GridTable4-Accent3"/>
-        <w:tblW w:w="0" w:type="auto"/>
+        <w:tblW w:w="9175" w:type="dxa"/>
+        <w:tblLayout w:type="fixed"/>
         <w:tblLook w:val="04A0" w:firstRow="1" w:lastRow="0" w:firstColumn="1" w:lastColumn="0" w:noHBand="0" w:noVBand="1"/>
       </w:tblPr>
       <w:tblGrid>
-        <w:gridCol w:w="1337"/>
-        <w:gridCol w:w="1898"/>
-        <w:gridCol w:w="3092"/>
-        <w:gridCol w:w="2689"/>
+        <w:gridCol w:w="1338"/>
+        <w:gridCol w:w="2077"/>
+        <w:gridCol w:w="2913"/>
+        <w:gridCol w:w="2847"/>
       </w:tblGrid>
       <w:tr>
         <w:trPr>
@@ -1316,7 +1399,7 @@
         <w:tc>
           <w:tcPr>
             <w:cnfStyle w:val="001000000000" w:firstRow="0" w:lastRow="0" w:firstColumn="1" w:lastColumn="0" w:oddVBand="0" w:evenVBand="0" w:oddHBand="0" w:evenHBand="0" w:firstRowFirstColumn="0" w:firstRowLastColumn="0" w:lastRowFirstColumn="0" w:lastRowLastColumn="0"/>
-            <w:tcW w:w="0" w:type="auto"/>
+            <w:tcW w:w="1338" w:type="dxa"/>
             <w:hideMark/>
           </w:tcPr>
           <w:p>
@@ -1325,15 +1408,15 @@
               <w:jc w:val="both"/>
               <w:rPr>
                 <w:rFonts w:ascii="Carlito" w:hAnsi="Carlito" w:cs="Carlito"/>
-                <w:sz w:val="32"/>
-                <w:szCs w:val="32"/>
+                <w:sz w:val="28"/>
+                <w:szCs w:val="28"/>
               </w:rPr>
             </w:pPr>
             <w:r>
               <w:rPr>
                 <w:rFonts w:ascii="Carlito" w:hAnsi="Carlito" w:cs="Carlito"/>
-                <w:sz w:val="32"/>
-                <w:szCs w:val="32"/>
+                <w:sz w:val="28"/>
+                <w:szCs w:val="28"/>
               </w:rPr>
               <w:t>Extension</w:t>
             </w:r>
@@ -1341,7 +1424,7 @@
         </w:tc>
         <w:tc>
           <w:tcPr>
-            <w:tcW w:w="0" w:type="auto"/>
+            <w:tcW w:w="2077" w:type="dxa"/>
             <w:hideMark/>
           </w:tcPr>
           <w:p>
@@ -1351,15 +1434,15 @@
               <w:cnfStyle w:val="100000000000" w:firstRow="1" w:lastRow="0" w:firstColumn="0" w:lastColumn="0" w:oddVBand="0" w:evenVBand="0" w:oddHBand="0" w:evenHBand="0" w:firstRowFirstColumn="0" w:firstRowLastColumn="0" w:lastRowFirstColumn="0" w:lastRowLastColumn="0"/>
               <w:rPr>
                 <w:rFonts w:ascii="Carlito" w:hAnsi="Carlito" w:cs="Carlito"/>
-                <w:sz w:val="32"/>
-                <w:szCs w:val="32"/>
+                <w:sz w:val="28"/>
+                <w:szCs w:val="28"/>
               </w:rPr>
             </w:pPr>
             <w:r>
               <w:rPr>
                 <w:rFonts w:ascii="Carlito" w:hAnsi="Carlito" w:cs="Carlito"/>
-                <w:sz w:val="32"/>
-                <w:szCs w:val="32"/>
+                <w:sz w:val="28"/>
+                <w:szCs w:val="28"/>
               </w:rPr>
               <w:t>Meaning</w:t>
             </w:r>
@@ -1367,7 +1450,7 @@
         </w:tc>
         <w:tc>
           <w:tcPr>
-            <w:tcW w:w="0" w:type="auto"/>
+            <w:tcW w:w="2913" w:type="dxa"/>
             <w:hideMark/>
           </w:tcPr>
           <w:p>
@@ -1377,15 +1460,15 @@
               <w:cnfStyle w:val="100000000000" w:firstRow="1" w:lastRow="0" w:firstColumn="0" w:lastColumn="0" w:oddVBand="0" w:evenVBand="0" w:oddHBand="0" w:evenHBand="0" w:firstRowFirstColumn="0" w:firstRowLastColumn="0" w:lastRowFirstColumn="0" w:lastRowLastColumn="0"/>
               <w:rPr>
                 <w:rFonts w:ascii="Carlito" w:hAnsi="Carlito" w:cs="Carlito"/>
-                <w:sz w:val="32"/>
-                <w:szCs w:val="32"/>
+                <w:sz w:val="28"/>
+                <w:szCs w:val="28"/>
               </w:rPr>
             </w:pPr>
             <w:r>
               <w:rPr>
                 <w:rFonts w:ascii="Carlito" w:hAnsi="Carlito" w:cs="Carlito"/>
-                <w:sz w:val="32"/>
-                <w:szCs w:val="32"/>
+                <w:sz w:val="28"/>
+                <w:szCs w:val="28"/>
               </w:rPr>
               <w:t>Formula</w:t>
             </w:r>
@@ -1393,7 +1476,7 @@
         </w:tc>
         <w:tc>
           <w:tcPr>
-            <w:tcW w:w="0" w:type="auto"/>
+            <w:tcW w:w="2847" w:type="dxa"/>
             <w:hideMark/>
           </w:tcPr>
           <w:p>
@@ -1403,15 +1486,15 @@
               <w:cnfStyle w:val="100000000000" w:firstRow="1" w:lastRow="0" w:firstColumn="0" w:lastColumn="0" w:oddVBand="0" w:evenVBand="0" w:oddHBand="0" w:evenHBand="0" w:firstRowFirstColumn="0" w:firstRowLastColumn="0" w:lastRowFirstColumn="0" w:lastRowLastColumn="0"/>
               <w:rPr>
                 <w:rFonts w:ascii="Carlito" w:hAnsi="Carlito" w:cs="Carlito"/>
-                <w:sz w:val="32"/>
-                <w:szCs w:val="32"/>
+                <w:sz w:val="28"/>
+                <w:szCs w:val="28"/>
               </w:rPr>
             </w:pPr>
             <w:r>
               <w:rPr>
                 <w:rFonts w:ascii="Carlito" w:hAnsi="Carlito" w:cs="Carlito"/>
-                <w:sz w:val="32"/>
-                <w:szCs w:val="32"/>
+                <w:sz w:val="28"/>
+                <w:szCs w:val="28"/>
               </w:rPr>
               <w:t>Use it for</w:t>
             </w:r>
@@ -1425,7 +1508,7 @@
         <w:tc>
           <w:tcPr>
             <w:cnfStyle w:val="001000000000" w:firstRow="0" w:lastRow="0" w:firstColumn="1" w:lastColumn="0" w:oddVBand="0" w:evenVBand="0" w:oddHBand="0" w:evenHBand="0" w:firstRowFirstColumn="0" w:firstRowLastColumn="0" w:lastRowFirstColumn="0" w:lastRowLastColumn="0"/>
-            <w:tcW w:w="0" w:type="auto"/>
+            <w:tcW w:w="1338" w:type="dxa"/>
             <w:hideMark/>
           </w:tcPr>
           <w:p>
@@ -1434,15 +1517,15 @@
               <w:jc w:val="both"/>
               <w:rPr>
                 <w:rFonts w:ascii="Carlito" w:hAnsi="Carlito" w:cs="Carlito"/>
-                <w:sz w:val="32"/>
-                <w:szCs w:val="32"/>
+                <w:sz w:val="28"/>
+                <w:szCs w:val="28"/>
               </w:rPr>
             </w:pPr>
             <w:r>
               <w:rPr>
                 <w:rFonts w:ascii="Carlito" w:hAnsi="Carlito" w:cs="Carlito"/>
-                <w:sz w:val="32"/>
-                <w:szCs w:val="32"/>
+                <w:sz w:val="28"/>
+                <w:szCs w:val="28"/>
               </w:rPr>
               <w:lastRenderedPageBreak/>
               <w:t>x.w</w:t>
@@ -1451,7 +1534,7 @@
         </w:tc>
         <w:tc>
           <w:tcPr>
-            <w:tcW w:w="0" w:type="auto"/>
+            <w:tcW w:w="2077" w:type="dxa"/>
             <w:hideMark/>
           </w:tcPr>
           <w:p>
@@ -1461,15 +1544,15 @@
               <w:cnfStyle w:val="000000100000" w:firstRow="0" w:lastRow="0" w:firstColumn="0" w:lastColumn="0" w:oddVBand="0" w:evenVBand="0" w:oddHBand="1" w:evenHBand="0" w:firstRowFirstColumn="0" w:firstRowLastColumn="0" w:lastRowFirstColumn="0" w:lastRowLastColumn="0"/>
               <w:rPr>
                 <w:rFonts w:ascii="Carlito" w:hAnsi="Carlito" w:cs="Carlito"/>
-                <w:sz w:val="32"/>
-                <w:szCs w:val="32"/>
+                <w:sz w:val="28"/>
+                <w:szCs w:val="28"/>
               </w:rPr>
             </w:pPr>
             <w:r>
               <w:rPr>
                 <w:rFonts w:ascii="Carlito" w:hAnsi="Carlito" w:cs="Carlito"/>
-                <w:sz w:val="32"/>
-                <w:szCs w:val="32"/>
+                <w:sz w:val="28"/>
+                <w:szCs w:val="28"/>
               </w:rPr>
               <w:t>Width scaled</w:t>
             </w:r>
@@ -1477,7 +1560,7 @@
         </w:tc>
         <w:tc>
           <w:tcPr>
-            <w:tcW w:w="0" w:type="auto"/>
+            <w:tcW w:w="2913" w:type="dxa"/>
             <w:hideMark/>
           </w:tcPr>
           <w:p>
@@ -1487,15 +1570,15 @@
               <w:cnfStyle w:val="000000100000" w:firstRow="0" w:lastRow="0" w:firstColumn="0" w:lastColumn="0" w:oddVBand="0" w:evenVBand="0" w:oddHBand="1" w:evenHBand="0" w:firstRowFirstColumn="0" w:firstRowLastColumn="0" w:lastRowFirstColumn="0" w:lastRowLastColumn="0"/>
               <w:rPr>
                 <w:rFonts w:ascii="Carlito" w:hAnsi="Carlito" w:cs="Carlito"/>
-                <w:sz w:val="32"/>
-                <w:szCs w:val="32"/>
+                <w:sz w:val="28"/>
+                <w:szCs w:val="28"/>
               </w:rPr>
             </w:pPr>
             <w:r>
               <w:rPr>
                 <w:rFonts w:ascii="Carlito" w:hAnsi="Carlito" w:cs="Carlito"/>
-                <w:sz w:val="32"/>
-                <w:szCs w:val="32"/>
+                <w:sz w:val="28"/>
+                <w:szCs w:val="28"/>
               </w:rPr>
               <w:t>x * scaleWidth</w:t>
             </w:r>
@@ -1503,7 +1586,7 @@
         </w:tc>
         <w:tc>
           <w:tcPr>
-            <w:tcW w:w="0" w:type="auto"/>
+            <w:tcW w:w="2847" w:type="dxa"/>
             <w:hideMark/>
           </w:tcPr>
           <w:p>
@@ -1513,15 +1596,15 @@
               <w:cnfStyle w:val="000000100000" w:firstRow="0" w:lastRow="0" w:firstColumn="0" w:lastColumn="0" w:oddVBand="0" w:evenVBand="0" w:oddHBand="1" w:evenHBand="0" w:firstRowFirstColumn="0" w:firstRowLastColumn="0" w:lastRowFirstColumn="0" w:lastRowLastColumn="0"/>
               <w:rPr>
                 <w:rFonts w:ascii="Carlito" w:hAnsi="Carlito" w:cs="Carlito"/>
-                <w:sz w:val="32"/>
-                <w:szCs w:val="32"/>
+                <w:sz w:val="28"/>
+                <w:szCs w:val="28"/>
               </w:rPr>
             </w:pPr>
             <w:r>
               <w:rPr>
                 <w:rFonts w:ascii="Carlito" w:hAnsi="Carlito" w:cs="Carlito"/>
-                <w:sz w:val="32"/>
-                <w:szCs w:val="32"/>
+                <w:sz w:val="28"/>
+                <w:szCs w:val="28"/>
               </w:rPr>
               <w:t>Widths, left/right padding</w:t>
             </w:r>
@@ -1532,7 +1615,7 @@
         <w:tc>
           <w:tcPr>
             <w:cnfStyle w:val="001000000000" w:firstRow="0" w:lastRow="0" w:firstColumn="1" w:lastColumn="0" w:oddVBand="0" w:evenVBand="0" w:oddHBand="0" w:evenHBand="0" w:firstRowFirstColumn="0" w:firstRowLastColumn="0" w:lastRowFirstColumn="0" w:lastRowLastColumn="0"/>
-            <w:tcW w:w="0" w:type="auto"/>
+            <w:tcW w:w="1338" w:type="dxa"/>
             <w:hideMark/>
           </w:tcPr>
           <w:p>
@@ -1541,15 +1624,15 @@
               <w:jc w:val="both"/>
               <w:rPr>
                 <w:rFonts w:ascii="Carlito" w:hAnsi="Carlito" w:cs="Carlito"/>
-                <w:sz w:val="32"/>
-                <w:szCs w:val="32"/>
+                <w:sz w:val="28"/>
+                <w:szCs w:val="28"/>
               </w:rPr>
             </w:pPr>
             <w:r>
               <w:rPr>
                 <w:rFonts w:ascii="Carlito" w:hAnsi="Carlito" w:cs="Carlito"/>
-                <w:sz w:val="32"/>
-                <w:szCs w:val="32"/>
+                <w:sz w:val="28"/>
+                <w:szCs w:val="28"/>
               </w:rPr>
               <w:t>x.h</w:t>
             </w:r>
@@ -1557,7 +1640,7 @@
         </w:tc>
         <w:tc>
           <w:tcPr>
-            <w:tcW w:w="0" w:type="auto"/>
+            <w:tcW w:w="2077" w:type="dxa"/>
             <w:hideMark/>
           </w:tcPr>
           <w:p>
@@ -1567,15 +1650,15 @@
               <w:cnfStyle w:val="000000000000" w:firstRow="0" w:lastRow="0" w:firstColumn="0" w:lastColumn="0" w:oddVBand="0" w:evenVBand="0" w:oddHBand="0" w:evenHBand="0" w:firstRowFirstColumn="0" w:firstRowLastColumn="0" w:lastRowFirstColumn="0" w:lastRowLastColumn="0"/>
               <w:rPr>
                 <w:rFonts w:ascii="Carlito" w:hAnsi="Carlito" w:cs="Carlito"/>
-                <w:sz w:val="32"/>
-                <w:szCs w:val="32"/>
+                <w:sz w:val="28"/>
+                <w:szCs w:val="28"/>
               </w:rPr>
             </w:pPr>
             <w:r>
               <w:rPr>
                 <w:rFonts w:ascii="Carlito" w:hAnsi="Carlito" w:cs="Carlito"/>
-                <w:sz w:val="32"/>
-                <w:szCs w:val="32"/>
+                <w:sz w:val="28"/>
+                <w:szCs w:val="28"/>
               </w:rPr>
               <w:t>Height scaled</w:t>
             </w:r>
@@ -1583,7 +1666,7 @@
         </w:tc>
         <w:tc>
           <w:tcPr>
-            <w:tcW w:w="0" w:type="auto"/>
+            <w:tcW w:w="2913" w:type="dxa"/>
             <w:hideMark/>
           </w:tcPr>
           <w:p>
@@ -1593,15 +1676,15 @@
               <w:cnfStyle w:val="000000000000" w:firstRow="0" w:lastRow="0" w:firstColumn="0" w:lastColumn="0" w:oddVBand="0" w:evenVBand="0" w:oddHBand="0" w:evenHBand="0" w:firstRowFirstColumn="0" w:firstRowLastColumn="0" w:lastRowFirstColumn="0" w:lastRowLastColumn="0"/>
               <w:rPr>
                 <w:rFonts w:ascii="Carlito" w:hAnsi="Carlito" w:cs="Carlito"/>
-                <w:sz w:val="32"/>
-                <w:szCs w:val="32"/>
+                <w:sz w:val="28"/>
+                <w:szCs w:val="28"/>
               </w:rPr>
             </w:pPr>
             <w:r>
               <w:rPr>
                 <w:rFonts w:ascii="Carlito" w:hAnsi="Carlito" w:cs="Carlito"/>
-                <w:sz w:val="32"/>
-                <w:szCs w:val="32"/>
+                <w:sz w:val="28"/>
+                <w:szCs w:val="28"/>
               </w:rPr>
               <w:t>x * scaleHeight</w:t>
             </w:r>
@@ -1609,7 +1692,7 @@
         </w:tc>
         <w:tc>
           <w:tcPr>
-            <w:tcW w:w="0" w:type="auto"/>
+            <w:tcW w:w="2847" w:type="dxa"/>
             <w:hideMark/>
           </w:tcPr>
           <w:p>
@@ -1619,15 +1702,15 @@
               <w:cnfStyle w:val="000000000000" w:firstRow="0" w:lastRow="0" w:firstColumn="0" w:lastColumn="0" w:oddVBand="0" w:evenVBand="0" w:oddHBand="0" w:evenHBand="0" w:firstRowFirstColumn="0" w:firstRowLastColumn="0" w:lastRowFirstColumn="0" w:lastRowLastColumn="0"/>
               <w:rPr>
                 <w:rFonts w:ascii="Carlito" w:hAnsi="Carlito" w:cs="Carlito"/>
-                <w:sz w:val="32"/>
-                <w:szCs w:val="32"/>
+                <w:sz w:val="28"/>
+                <w:szCs w:val="28"/>
               </w:rPr>
             </w:pPr>
             <w:r>
               <w:rPr>
                 <w:rFonts w:ascii="Carlito" w:hAnsi="Carlito" w:cs="Carlito"/>
-                <w:sz w:val="32"/>
-                <w:szCs w:val="32"/>
+                <w:sz w:val="28"/>
+                <w:szCs w:val="28"/>
               </w:rPr>
               <w:t>Heights, top/bottom padding</w:t>
             </w:r>
@@ -1641,7 +1724,7 @@
         <w:tc>
           <w:tcPr>
             <w:cnfStyle w:val="001000000000" w:firstRow="0" w:lastRow="0" w:firstColumn="1" w:lastColumn="0" w:oddVBand="0" w:evenVBand="0" w:oddHBand="0" w:evenHBand="0" w:firstRowFirstColumn="0" w:firstRowLastColumn="0" w:lastRowFirstColumn="0" w:lastRowLastColumn="0"/>
-            <w:tcW w:w="0" w:type="auto"/>
+            <w:tcW w:w="1338" w:type="dxa"/>
             <w:hideMark/>
           </w:tcPr>
           <w:p>
@@ -1650,15 +1733,15 @@
               <w:jc w:val="both"/>
               <w:rPr>
                 <w:rFonts w:ascii="Carlito" w:hAnsi="Carlito" w:cs="Carlito"/>
-                <w:sz w:val="32"/>
-                <w:szCs w:val="32"/>
+                <w:sz w:val="28"/>
+                <w:szCs w:val="28"/>
               </w:rPr>
             </w:pPr>
             <w:r>
               <w:rPr>
                 <w:rFonts w:ascii="Carlito" w:hAnsi="Carlito" w:cs="Carlito"/>
-                <w:sz w:val="32"/>
-                <w:szCs w:val="32"/>
+                <w:sz w:val="28"/>
+                <w:szCs w:val="28"/>
               </w:rPr>
               <w:t>x.r</w:t>
             </w:r>
@@ -1666,7 +1749,7 @@
         </w:tc>
         <w:tc>
           <w:tcPr>
-            <w:tcW w:w="0" w:type="auto"/>
+            <w:tcW w:w="2077" w:type="dxa"/>
             <w:hideMark/>
           </w:tcPr>
           <w:p>
@@ -1676,15 +1759,15 @@
               <w:cnfStyle w:val="000000100000" w:firstRow="0" w:lastRow="0" w:firstColumn="0" w:lastColumn="0" w:oddVBand="0" w:evenVBand="0" w:oddHBand="1" w:evenHBand="0" w:firstRowFirstColumn="0" w:firstRowLastColumn="0" w:lastRowFirstColumn="0" w:lastRowLastColumn="0"/>
               <w:rPr>
                 <w:rFonts w:ascii="Carlito" w:hAnsi="Carlito" w:cs="Carlito"/>
-                <w:sz w:val="32"/>
-                <w:szCs w:val="32"/>
+                <w:sz w:val="28"/>
+                <w:szCs w:val="28"/>
               </w:rPr>
             </w:pPr>
             <w:r>
               <w:rPr>
                 <w:rFonts w:ascii="Carlito" w:hAnsi="Carlito" w:cs="Carlito"/>
-                <w:sz w:val="32"/>
-                <w:szCs w:val="32"/>
+                <w:sz w:val="28"/>
+                <w:szCs w:val="28"/>
               </w:rPr>
               <w:t>Radius scaled</w:t>
             </w:r>
@@ -1692,7 +1775,7 @@
         </w:tc>
         <w:tc>
           <w:tcPr>
-            <w:tcW w:w="0" w:type="auto"/>
+            <w:tcW w:w="2913" w:type="dxa"/>
             <w:hideMark/>
           </w:tcPr>
           <w:p>
@@ -1702,15 +1785,15 @@
               <w:cnfStyle w:val="000000100000" w:firstRow="0" w:lastRow="0" w:firstColumn="0" w:lastColumn="0" w:oddVBand="0" w:evenVBand="0" w:oddHBand="1" w:evenHBand="0" w:firstRowFirstColumn="0" w:firstRowLastColumn="0" w:lastRowFirstColumn="0" w:lastRowLastColumn="0"/>
               <w:rPr>
                 <w:rFonts w:ascii="Carlito" w:hAnsi="Carlito" w:cs="Carlito"/>
-                <w:sz w:val="32"/>
-                <w:szCs w:val="32"/>
+                <w:sz w:val="28"/>
+                <w:szCs w:val="28"/>
               </w:rPr>
             </w:pPr>
             <w:r>
               <w:rPr>
                 <w:rFonts w:ascii="Carlito" w:hAnsi="Carlito" w:cs="Carlito"/>
-                <w:sz w:val="32"/>
-                <w:szCs w:val="32"/>
+                <w:sz w:val="28"/>
+                <w:szCs w:val="28"/>
               </w:rPr>
               <w:t>x * min(scaleW, scaleH)</w:t>
             </w:r>
@@ -1718,7 +1801,7 @@
         </w:tc>
         <w:tc>
           <w:tcPr>
-            <w:tcW w:w="0" w:type="auto"/>
+            <w:tcW w:w="2847" w:type="dxa"/>
             <w:hideMark/>
           </w:tcPr>
           <w:p>
@@ -1728,15 +1811,15 @@
               <w:cnfStyle w:val="000000100000" w:firstRow="0" w:lastRow="0" w:firstColumn="0" w:lastColumn="0" w:oddVBand="0" w:evenVBand="0" w:oddHBand="1" w:evenHBand="0" w:firstRowFirstColumn="0" w:firstRowLastColumn="0" w:lastRowFirstColumn="0" w:lastRowLastColumn="0"/>
               <w:rPr>
                 <w:rFonts w:ascii="Carlito" w:hAnsi="Carlito" w:cs="Carlito"/>
-                <w:sz w:val="32"/>
-                <w:szCs w:val="32"/>
+                <w:sz w:val="28"/>
+                <w:szCs w:val="28"/>
               </w:rPr>
             </w:pPr>
             <w:r>
               <w:rPr>
                 <w:rFonts w:ascii="Carlito" w:hAnsi="Carlito" w:cs="Carlito"/>
-                <w:sz w:val="32"/>
-                <w:szCs w:val="32"/>
+                <w:sz w:val="28"/>
+                <w:szCs w:val="28"/>
               </w:rPr>
               <w:t>Corners, borderRadius, circles</w:t>
             </w:r>
@@ -1747,7 +1830,7 @@
         <w:tc>
           <w:tcPr>
             <w:cnfStyle w:val="001000000000" w:firstRow="0" w:lastRow="0" w:firstColumn="1" w:lastColumn="0" w:oddVBand="0" w:evenVBand="0" w:oddHBand="0" w:evenHBand="0" w:firstRowFirstColumn="0" w:firstRowLastColumn="0" w:lastRowFirstColumn="0" w:lastRowLastColumn="0"/>
-            <w:tcW w:w="0" w:type="auto"/>
+            <w:tcW w:w="1338" w:type="dxa"/>
             <w:hideMark/>
           </w:tcPr>
           <w:p>
@@ -1756,15 +1839,15 @@
               <w:jc w:val="both"/>
               <w:rPr>
                 <w:rFonts w:ascii="Carlito" w:hAnsi="Carlito" w:cs="Carlito"/>
-                <w:sz w:val="32"/>
-                <w:szCs w:val="32"/>
+                <w:sz w:val="28"/>
+                <w:szCs w:val="28"/>
               </w:rPr>
             </w:pPr>
             <w:r>
               <w:rPr>
                 <w:rFonts w:ascii="Carlito" w:hAnsi="Carlito" w:cs="Carlito"/>
-                <w:sz w:val="32"/>
-                <w:szCs w:val="32"/>
+                <w:sz w:val="28"/>
+                <w:szCs w:val="28"/>
               </w:rPr>
               <w:t>x.sp</w:t>
             </w:r>
@@ -1772,7 +1855,7 @@
         </w:tc>
         <w:tc>
           <w:tcPr>
-            <w:tcW w:w="0" w:type="auto"/>
+            <w:tcW w:w="2077" w:type="dxa"/>
             <w:hideMark/>
           </w:tcPr>
           <w:p>
@@ -1782,15 +1865,15 @@
               <w:cnfStyle w:val="000000000000" w:firstRow="0" w:lastRow="0" w:firstColumn="0" w:lastColumn="0" w:oddVBand="0" w:evenVBand="0" w:oddHBand="0" w:evenHBand="0" w:firstRowFirstColumn="0" w:firstRowLastColumn="0" w:lastRowFirstColumn="0" w:lastRowLastColumn="0"/>
               <w:rPr>
                 <w:rFonts w:ascii="Carlito" w:hAnsi="Carlito" w:cs="Carlito"/>
-                <w:sz w:val="32"/>
-                <w:szCs w:val="32"/>
+                <w:sz w:val="28"/>
+                <w:szCs w:val="28"/>
               </w:rPr>
             </w:pPr>
             <w:r>
               <w:rPr>
                 <w:rFonts w:ascii="Carlito" w:hAnsi="Carlito" w:cs="Carlito"/>
-                <w:sz w:val="32"/>
-                <w:szCs w:val="32"/>
+                <w:sz w:val="28"/>
+                <w:szCs w:val="28"/>
               </w:rPr>
               <w:t>Font scaled</w:t>
             </w:r>
@@ -1798,7 +1881,7 @@
         </w:tc>
         <w:tc>
           <w:tcPr>
-            <w:tcW w:w="0" w:type="auto"/>
+            <w:tcW w:w="2913" w:type="dxa"/>
             <w:hideMark/>
           </w:tcPr>
           <w:p>
@@ -1808,15 +1891,15 @@
               <w:cnfStyle w:val="000000000000" w:firstRow="0" w:lastRow="0" w:firstColumn="0" w:lastColumn="0" w:oddVBand="0" w:evenVBand="0" w:oddHBand="0" w:evenHBand="0" w:firstRowFirstColumn="0" w:firstRowLastColumn="0" w:lastRowFirstColumn="0" w:lastRowLastColumn="0"/>
               <w:rPr>
                 <w:rFonts w:ascii="Carlito" w:hAnsi="Carlito" w:cs="Carlito"/>
-                <w:sz w:val="32"/>
-                <w:szCs w:val="32"/>
+                <w:sz w:val="28"/>
+                <w:szCs w:val="28"/>
               </w:rPr>
             </w:pPr>
             <w:r>
               <w:rPr>
                 <w:rFonts w:ascii="Carlito" w:hAnsi="Carlito" w:cs="Carlito"/>
-                <w:sz w:val="32"/>
-                <w:szCs w:val="32"/>
+                <w:sz w:val="28"/>
+                <w:szCs w:val="28"/>
               </w:rPr>
               <w:t>x * textScale</w:t>
             </w:r>
@@ -1824,7 +1907,7 @@
         </w:tc>
         <w:tc>
           <w:tcPr>
-            <w:tcW w:w="0" w:type="auto"/>
+            <w:tcW w:w="2847" w:type="dxa"/>
             <w:hideMark/>
           </w:tcPr>
           <w:p>
@@ -1834,15 +1917,15 @@
               <w:cnfStyle w:val="000000000000" w:firstRow="0" w:lastRow="0" w:firstColumn="0" w:lastColumn="0" w:oddVBand="0" w:evenVBand="0" w:oddHBand="0" w:evenHBand="0" w:firstRowFirstColumn="0" w:firstRowLastColumn="0" w:lastRowFirstColumn="0" w:lastRowLastColumn="0"/>
               <w:rPr>
                 <w:rFonts w:ascii="Carlito" w:hAnsi="Carlito" w:cs="Carlito"/>
-                <w:sz w:val="32"/>
-                <w:szCs w:val="32"/>
+                <w:sz w:val="28"/>
+                <w:szCs w:val="28"/>
               </w:rPr>
             </w:pPr>
             <w:r>
               <w:rPr>
                 <w:rFonts w:ascii="Carlito" w:hAnsi="Carlito" w:cs="Carlito"/>
-                <w:sz w:val="32"/>
-                <w:szCs w:val="32"/>
+                <w:sz w:val="28"/>
+                <w:szCs w:val="28"/>
               </w:rPr>
               <w:t>Font sizes</w:t>
             </w:r>
@@ -1856,7 +1939,7 @@
         <w:tc>
           <w:tcPr>
             <w:cnfStyle w:val="001000000000" w:firstRow="0" w:lastRow="0" w:firstColumn="1" w:lastColumn="0" w:oddVBand="0" w:evenVBand="0" w:oddHBand="0" w:evenHBand="0" w:firstRowFirstColumn="0" w:firstRowLastColumn="0" w:lastRowFirstColumn="0" w:lastRowLastColumn="0"/>
-            <w:tcW w:w="0" w:type="auto"/>
+            <w:tcW w:w="1338" w:type="dxa"/>
             <w:hideMark/>
           </w:tcPr>
           <w:p>
@@ -1865,15 +1948,15 @@
               <w:jc w:val="both"/>
               <w:rPr>
                 <w:rFonts w:ascii="Carlito" w:hAnsi="Carlito" w:cs="Carlito"/>
-                <w:sz w:val="32"/>
-                <w:szCs w:val="32"/>
+                <w:sz w:val="28"/>
+                <w:szCs w:val="28"/>
               </w:rPr>
             </w:pPr>
             <w:r>
               <w:rPr>
                 <w:rFonts w:ascii="Carlito" w:hAnsi="Carlito" w:cs="Carlito"/>
-                <w:sz w:val="32"/>
-                <w:szCs w:val="32"/>
+                <w:sz w:val="28"/>
+                <w:szCs w:val="28"/>
               </w:rPr>
               <w:t>x.sw</w:t>
             </w:r>
@@ -1881,7 +1964,7 @@
         </w:tc>
         <w:tc>
           <w:tcPr>
-            <w:tcW w:w="0" w:type="auto"/>
+            <w:tcW w:w="2077" w:type="dxa"/>
             <w:hideMark/>
           </w:tcPr>
           <w:p>
@@ -1891,15 +1974,15 @@
               <w:cnfStyle w:val="000000100000" w:firstRow="0" w:lastRow="0" w:firstColumn="0" w:lastColumn="0" w:oddVBand="0" w:evenVBand="0" w:oddHBand="1" w:evenHBand="0" w:firstRowFirstColumn="0" w:firstRowLastColumn="0" w:lastRowFirstColumn="0" w:lastRowLastColumn="0"/>
               <w:rPr>
                 <w:rFonts w:ascii="Carlito" w:hAnsi="Carlito" w:cs="Carlito"/>
-                <w:sz w:val="32"/>
-                <w:szCs w:val="32"/>
+                <w:sz w:val="28"/>
+                <w:szCs w:val="28"/>
               </w:rPr>
             </w:pPr>
             <w:r>
               <w:rPr>
                 <w:rFonts w:ascii="Carlito" w:hAnsi="Carlito" w:cs="Carlito"/>
-                <w:sz w:val="32"/>
-                <w:szCs w:val="32"/>
+                <w:sz w:val="28"/>
+                <w:szCs w:val="28"/>
               </w:rPr>
               <w:t>Screen width * fraction</w:t>
             </w:r>
@@ -1907,7 +1990,7 @@
         </w:tc>
         <w:tc>
           <w:tcPr>
-            <w:tcW w:w="0" w:type="auto"/>
+            <w:tcW w:w="2913" w:type="dxa"/>
             <w:hideMark/>
           </w:tcPr>
           <w:p>
@@ -1917,15 +2000,15 @@
               <w:cnfStyle w:val="000000100000" w:firstRow="0" w:lastRow="0" w:firstColumn="0" w:lastColumn="0" w:oddVBand="0" w:evenVBand="0" w:oddHBand="1" w:evenHBand="0" w:firstRowFirstColumn="0" w:firstRowLastColumn="0" w:lastRowFirstColumn="0" w:lastRowLastColumn="0"/>
               <w:rPr>
                 <w:rFonts w:ascii="Carlito" w:hAnsi="Carlito" w:cs="Carlito"/>
-                <w:sz w:val="32"/>
-                <w:szCs w:val="32"/>
+                <w:sz w:val="28"/>
+                <w:szCs w:val="28"/>
               </w:rPr>
             </w:pPr>
             <w:r>
               <w:rPr>
                 <w:rFonts w:ascii="Carlito" w:hAnsi="Carlito" w:cs="Carlito"/>
-                <w:sz w:val="32"/>
-                <w:szCs w:val="32"/>
+                <w:sz w:val="28"/>
+                <w:szCs w:val="28"/>
               </w:rPr>
               <w:t>ScreenUtil().screenWidth * x</w:t>
             </w:r>
@@ -1933,7 +2016,7 @@
         </w:tc>
         <w:tc>
           <w:tcPr>
-            <w:tcW w:w="0" w:type="auto"/>
+            <w:tcW w:w="2847" w:type="dxa"/>
             <w:hideMark/>
           </w:tcPr>
           <w:p>
@@ -1943,15 +2026,15 @@
               <w:cnfStyle w:val="000000100000" w:firstRow="0" w:lastRow="0" w:firstColumn="0" w:lastColumn="0" w:oddVBand="0" w:evenVBand="0" w:oddHBand="1" w:evenHBand="0" w:firstRowFirstColumn="0" w:firstRowLastColumn="0" w:lastRowFirstColumn="0" w:lastRowLastColumn="0"/>
               <w:rPr>
                 <w:rFonts w:ascii="Carlito" w:hAnsi="Carlito" w:cs="Carlito"/>
-                <w:sz w:val="32"/>
-                <w:szCs w:val="32"/>
+                <w:sz w:val="28"/>
+                <w:szCs w:val="28"/>
               </w:rPr>
             </w:pPr>
             <w:r>
               <w:rPr>
                 <w:rFonts w:ascii="Carlito" w:hAnsi="Carlito" w:cs="Carlito"/>
-                <w:sz w:val="32"/>
-                <w:szCs w:val="32"/>
+                <w:sz w:val="28"/>
+                <w:szCs w:val="28"/>
               </w:rPr>
               <w:t>% of screen width</w:t>
             </w:r>
@@ -1962,7 +2045,7 @@
         <w:tc>
           <w:tcPr>
             <w:cnfStyle w:val="001000000000" w:firstRow="0" w:lastRow="0" w:firstColumn="1" w:lastColumn="0" w:oddVBand="0" w:evenVBand="0" w:oddHBand="0" w:evenHBand="0" w:firstRowFirstColumn="0" w:firstRowLastColumn="0" w:lastRowFirstColumn="0" w:lastRowLastColumn="0"/>
-            <w:tcW w:w="0" w:type="auto"/>
+            <w:tcW w:w="1338" w:type="dxa"/>
             <w:hideMark/>
           </w:tcPr>
           <w:p>
@@ -1971,15 +2054,15 @@
               <w:jc w:val="both"/>
               <w:rPr>
                 <w:rFonts w:ascii="Carlito" w:hAnsi="Carlito" w:cs="Carlito"/>
-                <w:sz w:val="32"/>
-                <w:szCs w:val="32"/>
+                <w:sz w:val="28"/>
+                <w:szCs w:val="28"/>
               </w:rPr>
             </w:pPr>
             <w:r>
               <w:rPr>
                 <w:rFonts w:ascii="Carlito" w:hAnsi="Carlito" w:cs="Carlito"/>
-                <w:sz w:val="32"/>
-                <w:szCs w:val="32"/>
+                <w:sz w:val="28"/>
+                <w:szCs w:val="28"/>
               </w:rPr>
               <w:t>x.sh</w:t>
             </w:r>
@@ -1987,7 +2070,7 @@
         </w:tc>
         <w:tc>
           <w:tcPr>
-            <w:tcW w:w="0" w:type="auto"/>
+            <w:tcW w:w="2077" w:type="dxa"/>
             <w:hideMark/>
           </w:tcPr>
           <w:p>
@@ -1997,15 +2080,15 @@
               <w:cnfStyle w:val="000000000000" w:firstRow="0" w:lastRow="0" w:firstColumn="0" w:lastColumn="0" w:oddVBand="0" w:evenVBand="0" w:oddHBand="0" w:evenHBand="0" w:firstRowFirstColumn="0" w:firstRowLastColumn="0" w:lastRowFirstColumn="0" w:lastRowLastColumn="0"/>
               <w:rPr>
                 <w:rFonts w:ascii="Carlito" w:hAnsi="Carlito" w:cs="Carlito"/>
-                <w:sz w:val="32"/>
-                <w:szCs w:val="32"/>
+                <w:sz w:val="28"/>
+                <w:szCs w:val="28"/>
               </w:rPr>
             </w:pPr>
             <w:r>
               <w:rPr>
                 <w:rFonts w:ascii="Carlito" w:hAnsi="Carlito" w:cs="Carlito"/>
-                <w:sz w:val="32"/>
-                <w:szCs w:val="32"/>
+                <w:sz w:val="28"/>
+                <w:szCs w:val="28"/>
               </w:rPr>
               <w:t>Screen height * fraction</w:t>
             </w:r>
@@ -2013,7 +2096,7 @@
         </w:tc>
         <w:tc>
           <w:tcPr>
-            <w:tcW w:w="0" w:type="auto"/>
+            <w:tcW w:w="2913" w:type="dxa"/>
             <w:hideMark/>
           </w:tcPr>
           <w:p>
@@ -2023,15 +2106,15 @@
               <w:cnfStyle w:val="000000000000" w:firstRow="0" w:lastRow="0" w:firstColumn="0" w:lastColumn="0" w:oddVBand="0" w:evenVBand="0" w:oddHBand="0" w:evenHBand="0" w:firstRowFirstColumn="0" w:firstRowLastColumn="0" w:lastRowFirstColumn="0" w:lastRowLastColumn="0"/>
               <w:rPr>
                 <w:rFonts w:ascii="Carlito" w:hAnsi="Carlito" w:cs="Carlito"/>
-                <w:sz w:val="32"/>
-                <w:szCs w:val="32"/>
+                <w:sz w:val="28"/>
+                <w:szCs w:val="28"/>
               </w:rPr>
             </w:pPr>
             <w:r>
               <w:rPr>
                 <w:rFonts w:ascii="Carlito" w:hAnsi="Carlito" w:cs="Carlito"/>
-                <w:sz w:val="32"/>
-                <w:szCs w:val="32"/>
+                <w:sz w:val="28"/>
+                <w:szCs w:val="28"/>
               </w:rPr>
               <w:t>ScreenUtil().screenHeight * x</w:t>
             </w:r>
@@ -2039,7 +2122,7 @@
         </w:tc>
         <w:tc>
           <w:tcPr>
-            <w:tcW w:w="0" w:type="auto"/>
+            <w:tcW w:w="2847" w:type="dxa"/>
             <w:hideMark/>
           </w:tcPr>
           <w:p>
@@ -2049,15 +2132,15 @@
               <w:cnfStyle w:val="000000000000" w:firstRow="0" w:lastRow="0" w:firstColumn="0" w:lastColumn="0" w:oddVBand="0" w:evenVBand="0" w:oddHBand="0" w:evenHBand="0" w:firstRowFirstColumn="0" w:firstRowLastColumn="0" w:lastRowFirstColumn="0" w:lastRowLastColumn="0"/>
               <w:rPr>
                 <w:rFonts w:ascii="Carlito" w:hAnsi="Carlito" w:cs="Carlito"/>
-                <w:sz w:val="32"/>
-                <w:szCs w:val="32"/>
+                <w:sz w:val="28"/>
+                <w:szCs w:val="28"/>
               </w:rPr>
             </w:pPr>
             <w:r>
               <w:rPr>
                 <w:rFonts w:ascii="Carlito" w:hAnsi="Carlito" w:cs="Carlito"/>
-                <w:sz w:val="32"/>
-                <w:szCs w:val="32"/>
+                <w:sz w:val="28"/>
+                <w:szCs w:val="28"/>
               </w:rPr>
               <w:t>% of screen height</w:t>
             </w:r>
@@ -2071,7 +2154,7 @@
         <w:tc>
           <w:tcPr>
             <w:cnfStyle w:val="001000000000" w:firstRow="0" w:lastRow="0" w:firstColumn="1" w:lastColumn="0" w:oddVBand="0" w:evenVBand="0" w:oddHBand="0" w:evenHBand="0" w:firstRowFirstColumn="0" w:firstRowLastColumn="0" w:lastRowFirstColumn="0" w:lastRowLastColumn="0"/>
-            <w:tcW w:w="0" w:type="auto"/>
+            <w:tcW w:w="1338" w:type="dxa"/>
             <w:hideMark/>
           </w:tcPr>
           <w:p>
@@ -2080,15 +2163,15 @@
               <w:jc w:val="both"/>
               <w:rPr>
                 <w:rFonts w:ascii="Carlito" w:hAnsi="Carlito" w:cs="Carlito"/>
-                <w:sz w:val="32"/>
-                <w:szCs w:val="32"/>
+                <w:sz w:val="28"/>
+                <w:szCs w:val="28"/>
               </w:rPr>
             </w:pPr>
             <w:r>
               <w:rPr>
                 <w:rFonts w:ascii="Carlito" w:hAnsi="Carlito" w:cs="Carlito"/>
-                <w:sz w:val="32"/>
-                <w:szCs w:val="32"/>
+                <w:sz w:val="28"/>
+                <w:szCs w:val="28"/>
               </w:rPr>
               <w:t>.hw</w:t>
             </w:r>
@@ -2096,7 +2179,7 @@
         </w:tc>
         <w:tc>
           <w:tcPr>
-            <w:tcW w:w="0" w:type="auto"/>
+            <w:tcW w:w="2077" w:type="dxa"/>
             <w:hideMark/>
           </w:tcPr>
           <w:p>
@@ -2106,15 +2189,15 @@
               <w:cnfStyle w:val="000000100000" w:firstRow="0" w:lastRow="0" w:firstColumn="0" w:lastColumn="0" w:oddVBand="0" w:evenVBand="0" w:oddHBand="1" w:evenHBand="0" w:firstRowFirstColumn="0" w:firstRowLastColumn="0" w:lastRowFirstColumn="0" w:lastRowLastColumn="0"/>
               <w:rPr>
                 <w:rFonts w:ascii="Carlito" w:hAnsi="Carlito" w:cs="Carlito"/>
-                <w:sz w:val="32"/>
-                <w:szCs w:val="32"/>
+                <w:sz w:val="28"/>
+                <w:szCs w:val="28"/>
               </w:rPr>
             </w:pPr>
             <w:r>
               <w:rPr>
                 <w:rFonts w:ascii="Carlito" w:hAnsi="Carlito" w:cs="Carlito"/>
-                <w:sz w:val="32"/>
-                <w:szCs w:val="32"/>
+                <w:sz w:val="28"/>
+                <w:szCs w:val="28"/>
               </w:rPr>
               <w:t>Scale BoxConstraints (height+width)</w:t>
             </w:r>
@@ -2122,7 +2205,7 @@
         </w:tc>
         <w:tc>
           <w:tcPr>
-            <w:tcW w:w="0" w:type="auto"/>
+            <w:tcW w:w="2913" w:type="dxa"/>
             <w:hideMark/>
           </w:tcPr>
           <w:p>
@@ -2132,15 +2215,15 @@
               <w:cnfStyle w:val="000000100000" w:firstRow="0" w:lastRow="0" w:firstColumn="0" w:lastColumn="0" w:oddVBand="0" w:evenVBand="0" w:oddHBand="1" w:evenHBand="0" w:firstRowFirstColumn="0" w:firstRowLastColumn="0" w:lastRowFirstColumn="0" w:lastRowLastColumn="0"/>
               <w:rPr>
                 <w:rFonts w:ascii="Carlito" w:hAnsi="Carlito" w:cs="Carlito"/>
-                <w:sz w:val="32"/>
-                <w:szCs w:val="32"/>
+                <w:sz w:val="28"/>
+                <w:szCs w:val="28"/>
               </w:rPr>
             </w:pPr>
             <w:r>
               <w:rPr>
                 <w:rFonts w:ascii="Carlito" w:hAnsi="Carlito" w:cs="Carlito"/>
-                <w:sz w:val="32"/>
-                <w:szCs w:val="32"/>
+                <w:sz w:val="28"/>
+                <w:szCs w:val="28"/>
               </w:rPr>
               <w:t>Applies both w/h scaling</w:t>
             </w:r>
@@ -2148,7 +2231,7 @@
         </w:tc>
         <w:tc>
           <w:tcPr>
-            <w:tcW w:w="0" w:type="auto"/>
+            <w:tcW w:w="2847" w:type="dxa"/>
             <w:hideMark/>
           </w:tcPr>
           <w:p>
@@ -2158,15 +2241,15 @@
               <w:cnfStyle w:val="000000100000" w:firstRow="0" w:lastRow="0" w:firstColumn="0" w:lastColumn="0" w:oddVBand="0" w:evenVBand="0" w:oddHBand="1" w:evenHBand="0" w:firstRowFirstColumn="0" w:firstRowLastColumn="0" w:lastRowFirstColumn="0" w:lastRowLastColumn="0"/>
               <w:rPr>
                 <w:rFonts w:ascii="Carlito" w:hAnsi="Carlito" w:cs="Carlito"/>
-                <w:sz w:val="32"/>
-                <w:szCs w:val="32"/>
+                <w:sz w:val="28"/>
+                <w:szCs w:val="28"/>
               </w:rPr>
             </w:pPr>
             <w:r>
               <w:rPr>
                 <w:rFonts w:ascii="Carlito" w:hAnsi="Carlito" w:cs="Carlito"/>
-                <w:sz w:val="32"/>
-                <w:szCs w:val="32"/>
+                <w:sz w:val="28"/>
+                <w:szCs w:val="28"/>
               </w:rPr>
               <w:t>BoxConstraints(...).hw</w:t>
             </w:r>
@@ -2337,80 +2420,218 @@
           <w:sz w:val="32"/>
           <w:szCs w:val="32"/>
         </w:rPr>
+        <w:t># Font</w:t>
+      </w:r>
+    </w:p>
+    <w:p>
+      <w:pPr>
+        <w:jc w:val="both"/>
+        <w:rPr>
+          <w:rFonts w:ascii="Carlito" w:hAnsi="Carlito" w:cs="Carlito"/>
+          <w:b/>
+          <w:bCs/>
+          <w:color w:val="D86DCB" w:themeColor="accent5" w:themeTint="99"/>
+          <w:sz w:val="32"/>
+          <w:szCs w:val="32"/>
+        </w:rPr>
+      </w:pPr>
+      <w:r>
+        <w:rPr>
+          <w:rFonts w:ascii="Carlito" w:hAnsi="Carlito" w:cs="Carlito"/>
+          <w:b/>
+          <w:bCs/>
+          <w:color w:val="D86DCB" w:themeColor="accent5" w:themeTint="99"/>
+          <w:sz w:val="32"/>
+          <w:szCs w:val="32"/>
+        </w:rPr>
+        <w:t>Text(</w:t>
+      </w:r>
+    </w:p>
+    <w:p>
+      <w:pPr>
+        <w:jc w:val="both"/>
+        <w:rPr>
+          <w:rFonts w:ascii="Carlito" w:hAnsi="Carlito" w:cs="Carlito"/>
+          <w:b/>
+          <w:bCs/>
+          <w:color w:val="D86DCB" w:themeColor="accent5" w:themeTint="99"/>
+          <w:sz w:val="32"/>
+          <w:szCs w:val="32"/>
+        </w:rPr>
+      </w:pPr>
+      <w:r>
+        <w:rPr>
+          <w:rFonts w:ascii="Carlito" w:hAnsi="Carlito" w:cs="Carlito"/>
+          <w:b/>
+          <w:bCs/>
+          <w:color w:val="D86DCB" w:themeColor="accent5" w:themeTint="99"/>
+          <w:sz w:val="32"/>
+          <w:szCs w:val="32"/>
+        </w:rPr>
+        <w:t xml:space="preserve">  'Responsive Text',</w:t>
+      </w:r>
+    </w:p>
+    <w:p>
+      <w:pPr>
+        <w:jc w:val="both"/>
+        <w:rPr>
+          <w:rFonts w:ascii="Carlito" w:hAnsi="Carlito" w:cs="Carlito"/>
+          <w:b/>
+          <w:bCs/>
+          <w:color w:val="D86DCB" w:themeColor="accent5" w:themeTint="99"/>
+          <w:sz w:val="32"/>
+          <w:szCs w:val="32"/>
+        </w:rPr>
+      </w:pPr>
+      <w:r>
+        <w:rPr>
+          <w:rFonts w:ascii="Carlito" w:hAnsi="Carlito" w:cs="Carlito"/>
+          <w:b/>
+          <w:bCs/>
+          <w:color w:val="D86DCB" w:themeColor="accent5" w:themeTint="99"/>
+          <w:sz w:val="32"/>
+          <w:szCs w:val="32"/>
+        </w:rPr>
+        <w:t xml:space="preserve">  style: TextStyle(fontSize: 16.sp),</w:t>
+      </w:r>
+    </w:p>
+    <w:p>
+      <w:pPr>
+        <w:jc w:val="both"/>
+        <w:rPr>
+          <w:rFonts w:ascii="Carlito" w:hAnsi="Carlito" w:cs="Carlito"/>
+          <w:b/>
+          <w:bCs/>
+          <w:color w:val="D86DCB" w:themeColor="accent5" w:themeTint="99"/>
+          <w:sz w:val="32"/>
+          <w:szCs w:val="32"/>
+        </w:rPr>
+      </w:pPr>
+      <w:r>
+        <w:rPr>
+          <w:rFonts w:ascii="Carlito" w:hAnsi="Carlito" w:cs="Carlito"/>
+          <w:b/>
+          <w:bCs/>
+          <w:color w:val="D86DCB" w:themeColor="accent5" w:themeTint="99"/>
+          <w:sz w:val="32"/>
+          <w:szCs w:val="32"/>
+        </w:rPr>
+        <w:t>)</w:t>
+      </w:r>
+    </w:p>
+    <w:p>
+      <w:pPr>
+        <w:jc w:val="both"/>
+        <w:rPr>
+          <w:rFonts w:ascii="Carlito" w:hAnsi="Carlito" w:cs="Carlito"/>
+          <w:sz w:val="32"/>
+          <w:szCs w:val="32"/>
+        </w:rPr>
+      </w:pPr>
+      <w:r>
+        <w:rPr>
+          <w:rFonts w:ascii="Carlito" w:hAnsi="Carlito" w:cs="Carlito"/>
+          <w:sz w:val="32"/>
+          <w:szCs w:val="32"/>
+        </w:rPr>
         <w:lastRenderedPageBreak/>
-        <w:t># Font</w:t>
-      </w:r>
-    </w:p>
-    <w:p>
-      <w:pPr>
-        <w:jc w:val="both"/>
-        <w:rPr>
-          <w:rFonts w:ascii="Carlito" w:hAnsi="Carlito" w:cs="Carlito"/>
-          <w:b/>
-          <w:bCs/>
-          <w:color w:val="D86DCB" w:themeColor="accent5" w:themeTint="99"/>
-          <w:sz w:val="32"/>
-          <w:szCs w:val="32"/>
-        </w:rPr>
-      </w:pPr>
-      <w:r>
-        <w:rPr>
-          <w:rFonts w:ascii="Carlito" w:hAnsi="Carlito" w:cs="Carlito"/>
-          <w:b/>
-          <w:bCs/>
-          <w:color w:val="D86DCB" w:themeColor="accent5" w:themeTint="99"/>
-          <w:sz w:val="32"/>
-          <w:szCs w:val="32"/>
-        </w:rPr>
-        <w:t>Text(</w:t>
-      </w:r>
-    </w:p>
-    <w:p>
-      <w:pPr>
-        <w:jc w:val="both"/>
-        <w:rPr>
-          <w:rFonts w:ascii="Carlito" w:hAnsi="Carlito" w:cs="Carlito"/>
-          <w:b/>
-          <w:bCs/>
-          <w:color w:val="D86DCB" w:themeColor="accent5" w:themeTint="99"/>
-          <w:sz w:val="32"/>
-          <w:szCs w:val="32"/>
-        </w:rPr>
-      </w:pPr>
-      <w:r>
-        <w:rPr>
-          <w:rFonts w:ascii="Carlito" w:hAnsi="Carlito" w:cs="Carlito"/>
-          <w:b/>
-          <w:bCs/>
-          <w:color w:val="D86DCB" w:themeColor="accent5" w:themeTint="99"/>
-          <w:sz w:val="32"/>
-          <w:szCs w:val="32"/>
-        </w:rPr>
-        <w:t xml:space="preserve">  'Responsive Text',</w:t>
-      </w:r>
-    </w:p>
-    <w:p>
-      <w:pPr>
-        <w:jc w:val="both"/>
-        <w:rPr>
-          <w:rFonts w:ascii="Carlito" w:hAnsi="Carlito" w:cs="Carlito"/>
-          <w:b/>
-          <w:bCs/>
-          <w:color w:val="D86DCB" w:themeColor="accent5" w:themeTint="99"/>
-          <w:sz w:val="32"/>
-          <w:szCs w:val="32"/>
-        </w:rPr>
-      </w:pPr>
-      <w:r>
-        <w:rPr>
-          <w:rFonts w:ascii="Carlito" w:hAnsi="Carlito" w:cs="Carlito"/>
-          <w:b/>
-          <w:bCs/>
-          <w:color w:val="D86DCB" w:themeColor="accent5" w:themeTint="99"/>
-          <w:sz w:val="32"/>
-          <w:szCs w:val="32"/>
-        </w:rPr>
-        <w:t xml:space="preserve">  style: TextStyle(fontSize: 16.sp),</w:t>
+        <w:t># Radius</w:t>
+      </w:r>
+    </w:p>
+    <w:p>
+      <w:pPr>
+        <w:jc w:val="both"/>
+        <w:rPr>
+          <w:rFonts w:ascii="Carlito" w:hAnsi="Carlito" w:cs="Carlito"/>
+          <w:b/>
+          <w:bCs/>
+          <w:color w:val="D86DCB" w:themeColor="accent5" w:themeTint="99"/>
+          <w:sz w:val="32"/>
+          <w:szCs w:val="32"/>
+        </w:rPr>
+      </w:pPr>
+      <w:r>
+        <w:rPr>
+          <w:rFonts w:ascii="Carlito" w:hAnsi="Carlito" w:cs="Carlito"/>
+          <w:b/>
+          <w:bCs/>
+          <w:color w:val="D86DCB" w:themeColor="accent5" w:themeTint="99"/>
+          <w:sz w:val="32"/>
+          <w:szCs w:val="32"/>
+        </w:rPr>
+        <w:t>Container(</w:t>
+      </w:r>
+    </w:p>
+    <w:p>
+      <w:pPr>
+        <w:jc w:val="both"/>
+        <w:rPr>
+          <w:rFonts w:ascii="Carlito" w:hAnsi="Carlito" w:cs="Carlito"/>
+          <w:b/>
+          <w:bCs/>
+          <w:color w:val="D86DCB" w:themeColor="accent5" w:themeTint="99"/>
+          <w:sz w:val="32"/>
+          <w:szCs w:val="32"/>
+        </w:rPr>
+      </w:pPr>
+      <w:r>
+        <w:rPr>
+          <w:rFonts w:ascii="Carlito" w:hAnsi="Carlito" w:cs="Carlito"/>
+          <w:b/>
+          <w:bCs/>
+          <w:color w:val="D86DCB" w:themeColor="accent5" w:themeTint="99"/>
+          <w:sz w:val="32"/>
+          <w:szCs w:val="32"/>
+        </w:rPr>
+        <w:t xml:space="preserve">  decoration: BoxDecoration(</w:t>
+      </w:r>
+    </w:p>
+    <w:p>
+      <w:pPr>
+        <w:jc w:val="both"/>
+        <w:rPr>
+          <w:rFonts w:ascii="Carlito" w:hAnsi="Carlito" w:cs="Carlito"/>
+          <w:b/>
+          <w:bCs/>
+          <w:color w:val="D86DCB" w:themeColor="accent5" w:themeTint="99"/>
+          <w:sz w:val="32"/>
+          <w:szCs w:val="32"/>
+        </w:rPr>
+      </w:pPr>
+      <w:r>
+        <w:rPr>
+          <w:rFonts w:ascii="Carlito" w:hAnsi="Carlito" w:cs="Carlito"/>
+          <w:b/>
+          <w:bCs/>
+          <w:color w:val="D86DCB" w:themeColor="accent5" w:themeTint="99"/>
+          <w:sz w:val="32"/>
+          <w:szCs w:val="32"/>
+        </w:rPr>
+        <w:t xml:space="preserve">    borderRadius: BorderRadius.circular(12.r),</w:t>
+      </w:r>
+    </w:p>
+    <w:p>
+      <w:pPr>
+        <w:jc w:val="both"/>
+        <w:rPr>
+          <w:rFonts w:ascii="Carlito" w:hAnsi="Carlito" w:cs="Carlito"/>
+          <w:b/>
+          <w:bCs/>
+          <w:color w:val="D86DCB" w:themeColor="accent5" w:themeTint="99"/>
+          <w:sz w:val="32"/>
+          <w:szCs w:val="32"/>
+        </w:rPr>
+      </w:pPr>
+      <w:r>
+        <w:rPr>
+          <w:rFonts w:ascii="Carlito" w:hAnsi="Carlito" w:cs="Carlito"/>
+          <w:b/>
+          <w:bCs/>
+          <w:color w:val="D86DCB" w:themeColor="accent5" w:themeTint="99"/>
+          <w:sz w:val="32"/>
+          <w:szCs w:val="32"/>
+        </w:rPr>
+        <w:t xml:space="preserve">  ),</w:t>
       </w:r>
     </w:p>
     <w:p>
@@ -2452,7 +2673,15 @@
           <w:sz w:val="32"/>
           <w:szCs w:val="32"/>
         </w:rPr>
-        <w:t># Radius</w:t>
+        <w:t xml:space="preserve"># </w:t>
+      </w:r>
+      <w:r>
+        <w:rPr>
+          <w:rFonts w:ascii="Carlito" w:hAnsi="Carlito" w:cs="Carlito"/>
+          <w:sz w:val="32"/>
+          <w:szCs w:val="32"/>
+        </w:rPr>
+        <w:t>Percent of Screen</w:t>
       </w:r>
     </w:p>
     <w:p>
@@ -2500,55 +2729,31 @@
           <w:sz w:val="32"/>
           <w:szCs w:val="32"/>
         </w:rPr>
-        <w:t xml:space="preserve">  decoration: BoxDecoration(</w:t>
-      </w:r>
-    </w:p>
-    <w:p>
-      <w:pPr>
-        <w:jc w:val="both"/>
-        <w:rPr>
-          <w:rFonts w:ascii="Carlito" w:hAnsi="Carlito" w:cs="Carlito"/>
-          <w:b/>
-          <w:bCs/>
-          <w:color w:val="D86DCB" w:themeColor="accent5" w:themeTint="99"/>
-          <w:sz w:val="32"/>
-          <w:szCs w:val="32"/>
-        </w:rPr>
-      </w:pPr>
-      <w:r>
-        <w:rPr>
-          <w:rFonts w:ascii="Carlito" w:hAnsi="Carlito" w:cs="Carlito"/>
-          <w:b/>
-          <w:bCs/>
-          <w:color w:val="D86DCB" w:themeColor="accent5" w:themeTint="99"/>
-          <w:sz w:val="32"/>
-          <w:szCs w:val="32"/>
-        </w:rPr>
-        <w:t xml:space="preserve">    borderRadius: BorderRadius.circular(12.r),</w:t>
-      </w:r>
-    </w:p>
-    <w:p>
-      <w:pPr>
-        <w:jc w:val="both"/>
-        <w:rPr>
-          <w:rFonts w:ascii="Carlito" w:hAnsi="Carlito" w:cs="Carlito"/>
-          <w:b/>
-          <w:bCs/>
-          <w:color w:val="D86DCB" w:themeColor="accent5" w:themeTint="99"/>
-          <w:sz w:val="32"/>
-          <w:szCs w:val="32"/>
-        </w:rPr>
-      </w:pPr>
-      <w:r>
-        <w:rPr>
-          <w:rFonts w:ascii="Carlito" w:hAnsi="Carlito" w:cs="Carlito"/>
-          <w:b/>
-          <w:bCs/>
-          <w:color w:val="D86DCB" w:themeColor="accent5" w:themeTint="99"/>
-          <w:sz w:val="32"/>
-          <w:szCs w:val="32"/>
-        </w:rPr>
-        <w:t xml:space="preserve">  ),</w:t>
+        <w:t xml:space="preserve">  width: 0.5.sw,  // 50% of screen width</w:t>
+      </w:r>
+    </w:p>
+    <w:p>
+      <w:pPr>
+        <w:jc w:val="both"/>
+        <w:rPr>
+          <w:rFonts w:ascii="Carlito" w:hAnsi="Carlito" w:cs="Carlito"/>
+          <w:b/>
+          <w:bCs/>
+          <w:color w:val="D86DCB" w:themeColor="accent5" w:themeTint="99"/>
+          <w:sz w:val="32"/>
+          <w:szCs w:val="32"/>
+        </w:rPr>
+      </w:pPr>
+      <w:r>
+        <w:rPr>
+          <w:rFonts w:ascii="Carlito" w:hAnsi="Carlito" w:cs="Carlito"/>
+          <w:b/>
+          <w:bCs/>
+          <w:color w:val="D86DCB" w:themeColor="accent5" w:themeTint="99"/>
+          <w:sz w:val="32"/>
+          <w:szCs w:val="32"/>
+        </w:rPr>
+        <w:t xml:space="preserve">  height: 0.25.sh, // 25% of screen height</w:t>
       </w:r>
     </w:p>
     <w:p>
@@ -2590,15 +2795,15 @@
           <w:sz w:val="32"/>
           <w:szCs w:val="32"/>
         </w:rPr>
-        <w:t xml:space="preserve"># </w:t>
-      </w:r>
-      <w:r>
-        <w:rPr>
-          <w:rFonts w:ascii="Carlito" w:hAnsi="Carlito" w:cs="Carlito"/>
-          <w:sz w:val="32"/>
-          <w:szCs w:val="32"/>
-        </w:rPr>
-        <w:t>Percent of Screen</w:t>
+        <w:t>#</w:t>
+      </w:r>
+      <w:r>
+        <w:rPr>
+          <w:rFonts w:ascii="Carlito" w:hAnsi="Carlito" w:cs="Carlito"/>
+          <w:sz w:val="32"/>
+          <w:szCs w:val="32"/>
+        </w:rPr>
+        <w:t xml:space="preserve"> BoxConstraints</w:t>
       </w:r>
     </w:p>
     <w:p>
@@ -2646,31 +2851,7 @@
           <w:sz w:val="32"/>
           <w:szCs w:val="32"/>
         </w:rPr>
-        <w:t xml:space="preserve">  width: 0.5.sw,  // 50% of screen width</w:t>
-      </w:r>
-    </w:p>
-    <w:p>
-      <w:pPr>
-        <w:jc w:val="both"/>
-        <w:rPr>
-          <w:rFonts w:ascii="Carlito" w:hAnsi="Carlito" w:cs="Carlito"/>
-          <w:b/>
-          <w:bCs/>
-          <w:color w:val="D86DCB" w:themeColor="accent5" w:themeTint="99"/>
-          <w:sz w:val="32"/>
-          <w:szCs w:val="32"/>
-        </w:rPr>
-      </w:pPr>
-      <w:r>
-        <w:rPr>
-          <w:rFonts w:ascii="Carlito" w:hAnsi="Carlito" w:cs="Carlito"/>
-          <w:b/>
-          <w:bCs/>
-          <w:color w:val="D86DCB" w:themeColor="accent5" w:themeTint="99"/>
-          <w:sz w:val="32"/>
-          <w:szCs w:val="32"/>
-        </w:rPr>
-        <w:t xml:space="preserve">  height: 0.25.sh, // 25% of screen height</w:t>
+        <w:t xml:space="preserve">  constraints: BoxConstraints(maxWidth: 200, maxHeight: 250).hw,</w:t>
       </w:r>
     </w:p>
     <w:p>
@@ -2712,104 +2893,6 @@
           <w:sz w:val="32"/>
           <w:szCs w:val="32"/>
         </w:rPr>
-        <w:t>#</w:t>
-      </w:r>
-      <w:r>
-        <w:rPr>
-          <w:rFonts w:ascii="Carlito" w:hAnsi="Carlito" w:cs="Carlito"/>
-          <w:sz w:val="32"/>
-          <w:szCs w:val="32"/>
-        </w:rPr>
-        <w:t xml:space="preserve"> BoxConstraints</w:t>
-      </w:r>
-    </w:p>
-    <w:p>
-      <w:pPr>
-        <w:jc w:val="both"/>
-        <w:rPr>
-          <w:rFonts w:ascii="Carlito" w:hAnsi="Carlito" w:cs="Carlito"/>
-          <w:b/>
-          <w:bCs/>
-          <w:color w:val="D86DCB" w:themeColor="accent5" w:themeTint="99"/>
-          <w:sz w:val="32"/>
-          <w:szCs w:val="32"/>
-        </w:rPr>
-      </w:pPr>
-      <w:r>
-        <w:rPr>
-          <w:rFonts w:ascii="Carlito" w:hAnsi="Carlito" w:cs="Carlito"/>
-          <w:b/>
-          <w:bCs/>
-          <w:color w:val="D86DCB" w:themeColor="accent5" w:themeTint="99"/>
-          <w:sz w:val="32"/>
-          <w:szCs w:val="32"/>
-        </w:rPr>
-        <w:t>Container(</w:t>
-      </w:r>
-    </w:p>
-    <w:p>
-      <w:pPr>
-        <w:jc w:val="both"/>
-        <w:rPr>
-          <w:rFonts w:ascii="Carlito" w:hAnsi="Carlito" w:cs="Carlito"/>
-          <w:b/>
-          <w:bCs/>
-          <w:color w:val="D86DCB" w:themeColor="accent5" w:themeTint="99"/>
-          <w:sz w:val="32"/>
-          <w:szCs w:val="32"/>
-        </w:rPr>
-      </w:pPr>
-      <w:r>
-        <w:rPr>
-          <w:rFonts w:ascii="Carlito" w:hAnsi="Carlito" w:cs="Carlito"/>
-          <w:b/>
-          <w:bCs/>
-          <w:color w:val="D86DCB" w:themeColor="accent5" w:themeTint="99"/>
-          <w:sz w:val="32"/>
-          <w:szCs w:val="32"/>
-        </w:rPr>
-        <w:t xml:space="preserve">  constraints: BoxConstraints(maxWidth: 200, maxHeight: 250).hw,</w:t>
-      </w:r>
-    </w:p>
-    <w:p>
-      <w:pPr>
-        <w:jc w:val="both"/>
-        <w:rPr>
-          <w:rFonts w:ascii="Carlito" w:hAnsi="Carlito" w:cs="Carlito"/>
-          <w:b/>
-          <w:bCs/>
-          <w:color w:val="D86DCB" w:themeColor="accent5" w:themeTint="99"/>
-          <w:sz w:val="32"/>
-          <w:szCs w:val="32"/>
-        </w:rPr>
-      </w:pPr>
-      <w:r>
-        <w:rPr>
-          <w:rFonts w:ascii="Carlito" w:hAnsi="Carlito" w:cs="Carlito"/>
-          <w:b/>
-          <w:bCs/>
-          <w:color w:val="D86DCB" w:themeColor="accent5" w:themeTint="99"/>
-          <w:sz w:val="32"/>
-          <w:szCs w:val="32"/>
-        </w:rPr>
-        <w:t>)</w:t>
-      </w:r>
-    </w:p>
-    <w:p>
-      <w:pPr>
-        <w:jc w:val="both"/>
-        <w:rPr>
-          <w:rFonts w:ascii="Carlito" w:hAnsi="Carlito" w:cs="Carlito"/>
-          <w:sz w:val="32"/>
-          <w:szCs w:val="32"/>
-        </w:rPr>
-      </w:pPr>
-      <w:r>
-        <w:rPr>
-          <w:rFonts w:ascii="Carlito" w:hAnsi="Carlito" w:cs="Carlito"/>
-          <w:sz w:val="32"/>
-          <w:szCs w:val="32"/>
-        </w:rPr>
         <w:t xml:space="preserve"># Text scaling when </w:t>
       </w:r>
       <w:r>
@@ -2874,131 +2957,131 @@
           <w:sz w:val="32"/>
           <w:szCs w:val="32"/>
         </w:rPr>
+        <w:t>MediaQuery.textScaleFactor</w:t>
+      </w:r>
+      <w:r>
+        <w:rPr>
+          <w:rFonts w:ascii="Carlito" w:hAnsi="Carlito" w:cs="Carlito"/>
+          <w:sz w:val="32"/>
+          <w:szCs w:val="32"/>
+        </w:rPr>
+        <w:t>. This means text won’t blow up or shrink too much, and will respect user accessibility settings.</w:t>
+      </w:r>
+    </w:p>
+    <w:p>
+      <w:pPr>
+        <w:jc w:val="both"/>
+        <w:rPr>
+          <w:rFonts w:ascii="Carlito" w:hAnsi="Carlito" w:cs="Carlito"/>
+          <w:b/>
+          <w:bCs/>
+          <w:sz w:val="32"/>
+          <w:szCs w:val="32"/>
+        </w:rPr>
+      </w:pPr>
+      <w:r>
+        <w:rPr>
+          <w:rFonts w:ascii="Carlito" w:hAnsi="Carlito" w:cs="Carlito"/>
+          <w:sz w:val="32"/>
+          <w:szCs w:val="32"/>
+        </w:rPr>
+        <w:t># Responsive Grid</w:t>
+      </w:r>
+    </w:p>
+    <w:p>
+      <w:pPr>
+        <w:jc w:val="both"/>
+        <w:rPr>
+          <w:rFonts w:ascii="Carlito" w:hAnsi="Carlito" w:cs="Carlito"/>
+          <w:b/>
+          <w:bCs/>
+          <w:color w:val="D86DCB" w:themeColor="accent5" w:themeTint="99"/>
+          <w:sz w:val="32"/>
+          <w:szCs w:val="32"/>
+        </w:rPr>
+      </w:pPr>
+      <w:r>
+        <w:rPr>
+          <w:rFonts w:ascii="Carlito" w:hAnsi="Carlito" w:cs="Carlito"/>
+          <w:b/>
+          <w:bCs/>
+          <w:color w:val="D86DCB" w:themeColor="accent5" w:themeTint="99"/>
+          <w:sz w:val="32"/>
+          <w:szCs w:val="32"/>
+        </w:rPr>
+        <w:t>GridView.count(</w:t>
+      </w:r>
+    </w:p>
+    <w:p>
+      <w:pPr>
+        <w:jc w:val="both"/>
+        <w:rPr>
+          <w:rFonts w:ascii="Carlito" w:hAnsi="Carlito" w:cs="Carlito"/>
+          <w:b/>
+          <w:bCs/>
+          <w:color w:val="D86DCB" w:themeColor="accent5" w:themeTint="99"/>
+          <w:sz w:val="32"/>
+          <w:szCs w:val="32"/>
+        </w:rPr>
+      </w:pPr>
+      <w:r>
+        <w:rPr>
+          <w:rFonts w:ascii="Carlito" w:hAnsi="Carlito" w:cs="Carlito"/>
+          <w:b/>
+          <w:bCs/>
+          <w:color w:val="D86DCB" w:themeColor="accent5" w:themeTint="99"/>
+          <w:sz w:val="32"/>
+          <w:szCs w:val="32"/>
+        </w:rPr>
+        <w:t xml:space="preserve">  crossAxisCount: 2,</w:t>
+      </w:r>
+    </w:p>
+    <w:p>
+      <w:pPr>
+        <w:jc w:val="both"/>
+        <w:rPr>
+          <w:rFonts w:ascii="Carlito" w:hAnsi="Carlito" w:cs="Carlito"/>
+          <w:b/>
+          <w:bCs/>
+          <w:color w:val="D86DCB" w:themeColor="accent5" w:themeTint="99"/>
+          <w:sz w:val="32"/>
+          <w:szCs w:val="32"/>
+        </w:rPr>
+      </w:pPr>
+      <w:r>
+        <w:rPr>
+          <w:rFonts w:ascii="Carlito" w:hAnsi="Carlito" w:cs="Carlito"/>
+          <w:b/>
+          <w:bCs/>
+          <w:color w:val="D86DCB" w:themeColor="accent5" w:themeTint="99"/>
+          <w:sz w:val="32"/>
+          <w:szCs w:val="32"/>
+        </w:rPr>
+        <w:t xml:space="preserve">  crossAxisSpacing: 10.w,</w:t>
+      </w:r>
+    </w:p>
+    <w:p>
+      <w:pPr>
+        <w:jc w:val="both"/>
+        <w:rPr>
+          <w:rFonts w:ascii="Carlito" w:hAnsi="Carlito" w:cs="Carlito"/>
+          <w:b/>
+          <w:bCs/>
+          <w:color w:val="D86DCB" w:themeColor="accent5" w:themeTint="99"/>
+          <w:sz w:val="32"/>
+          <w:szCs w:val="32"/>
+        </w:rPr>
+      </w:pPr>
+      <w:r>
+        <w:rPr>
+          <w:rFonts w:ascii="Carlito" w:hAnsi="Carlito" w:cs="Carlito"/>
+          <w:b/>
+          <w:bCs/>
+          <w:color w:val="D86DCB" w:themeColor="accent5" w:themeTint="99"/>
+          <w:sz w:val="32"/>
+          <w:szCs w:val="32"/>
+        </w:rPr>
         <w:lastRenderedPageBreak/>
-        <w:t>MediaQuery.textScaleFactor</w:t>
-      </w:r>
-      <w:r>
-        <w:rPr>
-          <w:rFonts w:ascii="Carlito" w:hAnsi="Carlito" w:cs="Carlito"/>
-          <w:sz w:val="32"/>
-          <w:szCs w:val="32"/>
-        </w:rPr>
-        <w:t>. This means text won’t blow up or shrink too much, and will respect user accessibility settings.</w:t>
-      </w:r>
-    </w:p>
-    <w:p>
-      <w:pPr>
-        <w:jc w:val="both"/>
-        <w:rPr>
-          <w:rFonts w:ascii="Carlito" w:hAnsi="Carlito" w:cs="Carlito"/>
-          <w:b/>
-          <w:bCs/>
-          <w:sz w:val="32"/>
-          <w:szCs w:val="32"/>
-        </w:rPr>
-      </w:pPr>
-      <w:r>
-        <w:rPr>
-          <w:rFonts w:ascii="Carlito" w:hAnsi="Carlito" w:cs="Carlito"/>
-          <w:sz w:val="32"/>
-          <w:szCs w:val="32"/>
-        </w:rPr>
-        <w:t># Responsive Grid</w:t>
-      </w:r>
-    </w:p>
-    <w:p>
-      <w:pPr>
-        <w:jc w:val="both"/>
-        <w:rPr>
-          <w:rFonts w:ascii="Carlito" w:hAnsi="Carlito" w:cs="Carlito"/>
-          <w:b/>
-          <w:bCs/>
-          <w:color w:val="D86DCB" w:themeColor="accent5" w:themeTint="99"/>
-          <w:sz w:val="32"/>
-          <w:szCs w:val="32"/>
-        </w:rPr>
-      </w:pPr>
-      <w:r>
-        <w:rPr>
-          <w:rFonts w:ascii="Carlito" w:hAnsi="Carlito" w:cs="Carlito"/>
-          <w:b/>
-          <w:bCs/>
-          <w:color w:val="D86DCB" w:themeColor="accent5" w:themeTint="99"/>
-          <w:sz w:val="32"/>
-          <w:szCs w:val="32"/>
-        </w:rPr>
-        <w:t>GridView.count(</w:t>
-      </w:r>
-    </w:p>
-    <w:p>
-      <w:pPr>
-        <w:jc w:val="both"/>
-        <w:rPr>
-          <w:rFonts w:ascii="Carlito" w:hAnsi="Carlito" w:cs="Carlito"/>
-          <w:b/>
-          <w:bCs/>
-          <w:color w:val="D86DCB" w:themeColor="accent5" w:themeTint="99"/>
-          <w:sz w:val="32"/>
-          <w:szCs w:val="32"/>
-        </w:rPr>
-      </w:pPr>
-      <w:r>
-        <w:rPr>
-          <w:rFonts w:ascii="Carlito" w:hAnsi="Carlito" w:cs="Carlito"/>
-          <w:b/>
-          <w:bCs/>
-          <w:color w:val="D86DCB" w:themeColor="accent5" w:themeTint="99"/>
-          <w:sz w:val="32"/>
-          <w:szCs w:val="32"/>
-        </w:rPr>
-        <w:t xml:space="preserve">  crossAxisCount: 2,</w:t>
-      </w:r>
-    </w:p>
-    <w:p>
-      <w:pPr>
-        <w:jc w:val="both"/>
-        <w:rPr>
-          <w:rFonts w:ascii="Carlito" w:hAnsi="Carlito" w:cs="Carlito"/>
-          <w:b/>
-          <w:bCs/>
-          <w:color w:val="D86DCB" w:themeColor="accent5" w:themeTint="99"/>
-          <w:sz w:val="32"/>
-          <w:szCs w:val="32"/>
-        </w:rPr>
-      </w:pPr>
-      <w:r>
-        <w:rPr>
-          <w:rFonts w:ascii="Carlito" w:hAnsi="Carlito" w:cs="Carlito"/>
-          <w:b/>
-          <w:bCs/>
-          <w:color w:val="D86DCB" w:themeColor="accent5" w:themeTint="99"/>
-          <w:sz w:val="32"/>
-          <w:szCs w:val="32"/>
-        </w:rPr>
-        <w:t xml:space="preserve">  crossAxisSpacing: 10.w,</w:t>
-      </w:r>
-    </w:p>
-    <w:p>
-      <w:pPr>
-        <w:jc w:val="both"/>
-        <w:rPr>
-          <w:rFonts w:ascii="Carlito" w:hAnsi="Carlito" w:cs="Carlito"/>
-          <w:b/>
-          <w:bCs/>
-          <w:color w:val="D86DCB" w:themeColor="accent5" w:themeTint="99"/>
-          <w:sz w:val="32"/>
-          <w:szCs w:val="32"/>
-        </w:rPr>
-      </w:pPr>
-      <w:r>
-        <w:rPr>
-          <w:rFonts w:ascii="Carlito" w:hAnsi="Carlito" w:cs="Carlito"/>
-          <w:b/>
-          <w:bCs/>
-          <w:color w:val="D86DCB" w:themeColor="accent5" w:themeTint="99"/>
-          <w:sz w:val="32"/>
-          <w:szCs w:val="32"/>
-        </w:rPr>
         <w:t xml:space="preserve">  mainAxisSpacing: 10.h,</w:t>
       </w:r>
     </w:p>
@@ -3380,7 +3463,6 @@
           <w:sz w:val="32"/>
           <w:szCs w:val="32"/>
         </w:rPr>
-        <w:lastRenderedPageBreak/>
         <w:t>minWidth</w:t>
       </w:r>
       <w:r>
@@ -3570,6 +3652,7 @@
           <w:sz w:val="32"/>
           <w:szCs w:val="32"/>
         </w:rPr>
+        <w:lastRenderedPageBreak/>
         <w:t># Use it when we want to prevent widgets from stretching too big or shrinking too small, control image or card sizes in</w:t>
       </w:r>
     </w:p>
@@ -4066,7 +4149,6 @@
           <w:sz w:val="32"/>
           <w:szCs w:val="32"/>
         </w:rPr>
-        <w:lastRenderedPageBreak/>
         <w:t>ScreenUtil().scaleHeight</w:t>
       </w:r>
       <w:r>
@@ -4317,6 +4399,7 @@
           <w:sz w:val="32"/>
           <w:szCs w:val="32"/>
         </w:rPr>
+        <w:lastRenderedPageBreak/>
         <w:t>Advanced Usage:</w:t>
       </w:r>
     </w:p>
@@ -4475,7 +4558,41 @@
           <w:sz w:val="32"/>
           <w:szCs w:val="32"/>
         </w:rPr>
-        <w:t># Manually update ScreenUtil. If we want to re-init on orientation change:</w:t>
+        <w:t xml:space="preserve"># Manually update </w:t>
+      </w:r>
+      <w:r>
+        <w:rPr>
+          <w:rFonts w:ascii="Carlito" w:hAnsi="Carlito" w:cs="Carlito"/>
+          <w:b/>
+          <w:bCs/>
+          <w:sz w:val="32"/>
+          <w:szCs w:val="32"/>
+        </w:rPr>
+        <w:t>ScreenUtil</w:t>
+      </w:r>
+      <w:r>
+        <w:rPr>
+          <w:rFonts w:ascii="Carlito" w:hAnsi="Carlito" w:cs="Carlito"/>
+          <w:sz w:val="32"/>
+          <w:szCs w:val="32"/>
+        </w:rPr>
+        <w:t>. If we want to re-init</w:t>
+      </w:r>
+      <w:r>
+        <w:rPr>
+          <w:rFonts w:ascii="Carlito" w:hAnsi="Carlito" w:cs="Carlito"/>
+          <w:sz w:val="32"/>
+          <w:szCs w:val="32"/>
+        </w:rPr>
+        <w:t>ialize</w:t>
+      </w:r>
+      <w:r>
+        <w:rPr>
+          <w:rFonts w:ascii="Carlito" w:hAnsi="Carlito" w:cs="Carlito"/>
+          <w:sz w:val="32"/>
+          <w:szCs w:val="32"/>
+        </w:rPr>
+        <w:t xml:space="preserve"> on orientation change:</w:t>
       </w:r>
     </w:p>
     <w:p>
@@ -4698,117 +4815,117 @@
           <w:sz w:val="32"/>
           <w:szCs w:val="32"/>
         </w:rPr>
+        <w:t xml:space="preserve">For images with </w:t>
+      </w:r>
+      <w:r>
+        <w:rPr>
+          <w:rFonts w:ascii="Carlito" w:hAnsi="Carlito" w:cs="Carlito"/>
+          <w:b/>
+          <w:bCs/>
+          <w:sz w:val="32"/>
+          <w:szCs w:val="32"/>
+        </w:rPr>
+        <w:t>BoxFit.cover</w:t>
+      </w:r>
+      <w:r>
+        <w:rPr>
+          <w:rFonts w:ascii="Carlito" w:hAnsi="Carlito" w:cs="Carlito"/>
+          <w:sz w:val="32"/>
+          <w:szCs w:val="32"/>
+        </w:rPr>
+        <w:t xml:space="preserve"> scaling is handled by </w:t>
+      </w:r>
+      <w:r>
+        <w:rPr>
+          <w:rFonts w:ascii="Carlito" w:hAnsi="Carlito" w:cs="Carlito"/>
+          <w:b/>
+          <w:bCs/>
+          <w:sz w:val="32"/>
+          <w:szCs w:val="32"/>
+        </w:rPr>
+        <w:t>Flutter</w:t>
+      </w:r>
+      <w:r>
+        <w:rPr>
+          <w:rFonts w:ascii="Carlito" w:hAnsi="Carlito" w:cs="Carlito"/>
+          <w:sz w:val="32"/>
+          <w:szCs w:val="32"/>
+        </w:rPr>
+        <w:t xml:space="preserve"> itself.</w:t>
+      </w:r>
+    </w:p>
+    <w:p>
+      <w:pPr>
+        <w:jc w:val="both"/>
+        <w:rPr>
+          <w:rFonts w:ascii="Carlito" w:hAnsi="Carlito" w:cs="Carlito"/>
+          <w:sz w:val="32"/>
+          <w:szCs w:val="32"/>
+        </w:rPr>
+      </w:pPr>
+      <w:r>
+        <w:rPr>
+          <w:rFonts w:ascii="Carlito" w:hAnsi="Carlito" w:cs="Carlito"/>
+          <w:sz w:val="32"/>
+          <w:szCs w:val="32"/>
+        </w:rPr>
+        <w:t xml:space="preserve"># </w:t>
+      </w:r>
+      <w:r>
+        <w:rPr>
+          <w:rFonts w:ascii="Carlito" w:hAnsi="Carlito" w:cs="Carlito"/>
+          <w:sz w:val="32"/>
+          <w:szCs w:val="32"/>
+        </w:rPr>
+        <w:t xml:space="preserve">Use </w:t>
+      </w:r>
+      <w:r>
+        <w:rPr>
+          <w:rFonts w:ascii="Carlito" w:hAnsi="Carlito" w:cs="Carlito"/>
+          <w:b/>
+          <w:bCs/>
+          <w:sz w:val="32"/>
+          <w:szCs w:val="32"/>
+        </w:rPr>
+        <w:t>ScreenUtil</w:t>
+      </w:r>
+      <w:r>
+        <w:rPr>
+          <w:rFonts w:ascii="Carlito" w:hAnsi="Carlito" w:cs="Carlito"/>
+          <w:sz w:val="32"/>
+          <w:szCs w:val="32"/>
+        </w:rPr>
+        <w:t xml:space="preserve"> for fine control of consistent sizes, not for major layout decisions.</w:t>
+      </w:r>
+    </w:p>
+    <w:p>
+      <w:pPr>
+        <w:jc w:val="both"/>
+        <w:rPr>
+          <w:rFonts w:ascii="Carlito" w:hAnsi="Carlito" w:cs="Carlito"/>
+          <w:sz w:val="32"/>
+          <w:szCs w:val="32"/>
+        </w:rPr>
+      </w:pPr>
+    </w:p>
+    <w:p>
+      <w:pPr>
+        <w:jc w:val="both"/>
+        <w:rPr>
+          <w:rFonts w:ascii="Carlito" w:hAnsi="Carlito" w:cs="Carlito"/>
+          <w:sz w:val="32"/>
+          <w:szCs w:val="32"/>
+        </w:rPr>
+      </w:pPr>
+      <w:r>
+        <w:rPr>
+          <w:rFonts w:ascii="Carlito" w:hAnsi="Carlito" w:cs="Carlito"/>
+          <w:b/>
+          <w:bCs/>
+          <w:sz w:val="32"/>
+          <w:szCs w:val="32"/>
+        </w:rPr>
         <w:lastRenderedPageBreak/>
-        <w:t xml:space="preserve">For images with </w:t>
-      </w:r>
-      <w:r>
-        <w:rPr>
-          <w:rFonts w:ascii="Carlito" w:hAnsi="Carlito" w:cs="Carlito"/>
-          <w:b/>
-          <w:bCs/>
-          <w:sz w:val="32"/>
-          <w:szCs w:val="32"/>
-        </w:rPr>
-        <w:t>BoxFit.cover</w:t>
-      </w:r>
-      <w:r>
-        <w:rPr>
-          <w:rFonts w:ascii="Carlito" w:hAnsi="Carlito" w:cs="Carlito"/>
-          <w:sz w:val="32"/>
-          <w:szCs w:val="32"/>
-        </w:rPr>
-        <w:t xml:space="preserve"> scaling is handled by </w:t>
-      </w:r>
-      <w:r>
-        <w:rPr>
-          <w:rFonts w:ascii="Carlito" w:hAnsi="Carlito" w:cs="Carlito"/>
-          <w:b/>
-          <w:bCs/>
-          <w:sz w:val="32"/>
-          <w:szCs w:val="32"/>
-        </w:rPr>
-        <w:t>Flutter</w:t>
-      </w:r>
-      <w:r>
-        <w:rPr>
-          <w:rFonts w:ascii="Carlito" w:hAnsi="Carlito" w:cs="Carlito"/>
-          <w:sz w:val="32"/>
-          <w:szCs w:val="32"/>
-        </w:rPr>
-        <w:t xml:space="preserve"> itself.</w:t>
-      </w:r>
-    </w:p>
-    <w:p>
-      <w:pPr>
-        <w:jc w:val="both"/>
-        <w:rPr>
-          <w:rFonts w:ascii="Carlito" w:hAnsi="Carlito" w:cs="Carlito"/>
-          <w:sz w:val="32"/>
-          <w:szCs w:val="32"/>
-        </w:rPr>
-      </w:pPr>
-      <w:r>
-        <w:rPr>
-          <w:rFonts w:ascii="Carlito" w:hAnsi="Carlito" w:cs="Carlito"/>
-          <w:sz w:val="32"/>
-          <w:szCs w:val="32"/>
-        </w:rPr>
-        <w:t xml:space="preserve"># </w:t>
-      </w:r>
-      <w:r>
-        <w:rPr>
-          <w:rFonts w:ascii="Carlito" w:hAnsi="Carlito" w:cs="Carlito"/>
-          <w:sz w:val="32"/>
-          <w:szCs w:val="32"/>
-        </w:rPr>
-        <w:t xml:space="preserve">Use </w:t>
-      </w:r>
-      <w:r>
-        <w:rPr>
-          <w:rFonts w:ascii="Carlito" w:hAnsi="Carlito" w:cs="Carlito"/>
-          <w:b/>
-          <w:bCs/>
-          <w:sz w:val="32"/>
-          <w:szCs w:val="32"/>
-        </w:rPr>
-        <w:t>ScreenUtil</w:t>
-      </w:r>
-      <w:r>
-        <w:rPr>
-          <w:rFonts w:ascii="Carlito" w:hAnsi="Carlito" w:cs="Carlito"/>
-          <w:sz w:val="32"/>
-          <w:szCs w:val="32"/>
-        </w:rPr>
-        <w:t xml:space="preserve"> for fine control of consistent sizes, not for major layout decisions.</w:t>
-      </w:r>
-    </w:p>
-    <w:p>
-      <w:pPr>
-        <w:jc w:val="both"/>
-        <w:rPr>
-          <w:rFonts w:ascii="Carlito" w:hAnsi="Carlito" w:cs="Carlito"/>
-          <w:sz w:val="32"/>
-          <w:szCs w:val="32"/>
-        </w:rPr>
-      </w:pPr>
-    </w:p>
-    <w:p>
-      <w:pPr>
-        <w:jc w:val="both"/>
-        <w:rPr>
-          <w:rFonts w:ascii="Carlito" w:hAnsi="Carlito" w:cs="Carlito"/>
-          <w:sz w:val="32"/>
-          <w:szCs w:val="32"/>
-        </w:rPr>
-      </w:pPr>
-      <w:r>
-        <w:rPr>
-          <w:rFonts w:ascii="Carlito" w:hAnsi="Carlito" w:cs="Carlito"/>
-          <w:b/>
-          <w:bCs/>
-          <w:sz w:val="32"/>
-          <w:szCs w:val="32"/>
-        </w:rPr>
         <w:t>NOTE</w:t>
       </w:r>
       <w:r>
@@ -5205,97 +5322,97 @@
           <w:sz w:val="32"/>
           <w:szCs w:val="32"/>
         </w:rPr>
+        <w:t>#</w:t>
+      </w:r>
+      <w:r>
+        <w:rPr>
+          <w:rFonts w:ascii="Carlito" w:hAnsi="Carlito" w:cs="Carlito"/>
+          <w:b/>
+          <w:bCs/>
+          <w:sz w:val="32"/>
+          <w:szCs w:val="32"/>
+        </w:rPr>
+        <w:t xml:space="preserve"> screenutil</w:t>
+      </w:r>
+      <w:r>
+        <w:rPr>
+          <w:rFonts w:ascii="Carlito" w:hAnsi="Carlito" w:cs="Carlito"/>
+          <w:sz w:val="32"/>
+          <w:szCs w:val="32"/>
+        </w:rPr>
+        <w:t xml:space="preserve"> would make our text giant on a 1920px screen. It's not responsive, it's proportional scaling. Those are different things. We use Breakpoints instead, define once, use everywhere</w:t>
+      </w:r>
+    </w:p>
+    <w:p>
+      <w:pPr>
+        <w:jc w:val="both"/>
+        <w:rPr>
+          <w:rFonts w:ascii="Carlito" w:hAnsi="Carlito" w:cs="Carlito"/>
+          <w:b/>
+          <w:bCs/>
+          <w:color w:val="D86DCB" w:themeColor="accent5" w:themeTint="99"/>
+          <w:sz w:val="32"/>
+          <w:szCs w:val="32"/>
+        </w:rPr>
+      </w:pPr>
+      <w:r>
+        <w:rPr>
+          <w:rFonts w:ascii="Carlito" w:hAnsi="Carlito" w:cs="Carlito"/>
+          <w:b/>
+          <w:bCs/>
+          <w:color w:val="D86DCB" w:themeColor="accent5" w:themeTint="99"/>
+          <w:sz w:val="32"/>
+          <w:szCs w:val="32"/>
+        </w:rPr>
+        <w:t>class AppBreakpoints {</w:t>
+      </w:r>
+    </w:p>
+    <w:p>
+      <w:pPr>
+        <w:jc w:val="both"/>
+        <w:rPr>
+          <w:rFonts w:ascii="Carlito" w:hAnsi="Carlito" w:cs="Carlito"/>
+          <w:b/>
+          <w:bCs/>
+          <w:color w:val="D86DCB" w:themeColor="accent5" w:themeTint="99"/>
+          <w:sz w:val="32"/>
+          <w:szCs w:val="32"/>
+        </w:rPr>
+      </w:pPr>
+      <w:r>
+        <w:rPr>
+          <w:rFonts w:ascii="Carlito" w:hAnsi="Carlito" w:cs="Carlito"/>
+          <w:b/>
+          <w:bCs/>
+          <w:color w:val="D86DCB" w:themeColor="accent5" w:themeTint="99"/>
+          <w:sz w:val="32"/>
+          <w:szCs w:val="32"/>
+        </w:rPr>
+        <w:t xml:space="preserve">  static const double mobile = 600;</w:t>
+      </w:r>
+    </w:p>
+    <w:p>
+      <w:pPr>
+        <w:jc w:val="both"/>
+        <w:rPr>
+          <w:rFonts w:ascii="Carlito" w:hAnsi="Carlito" w:cs="Carlito"/>
+          <w:b/>
+          <w:bCs/>
+          <w:color w:val="D86DCB" w:themeColor="accent5" w:themeTint="99"/>
+          <w:sz w:val="32"/>
+          <w:szCs w:val="32"/>
+        </w:rPr>
+      </w:pPr>
+      <w:r>
+        <w:rPr>
+          <w:rFonts w:ascii="Carlito" w:hAnsi="Carlito" w:cs="Carlito"/>
+          <w:b/>
+          <w:bCs/>
+          <w:color w:val="D86DCB" w:themeColor="accent5" w:themeTint="99"/>
+          <w:sz w:val="32"/>
+          <w:szCs w:val="32"/>
+        </w:rPr>
         <w:lastRenderedPageBreak/>
-        <w:t>#</w:t>
-      </w:r>
-      <w:r>
-        <w:rPr>
-          <w:rFonts w:ascii="Carlito" w:hAnsi="Carlito" w:cs="Carlito"/>
-          <w:b/>
-          <w:bCs/>
-          <w:sz w:val="32"/>
-          <w:szCs w:val="32"/>
-        </w:rPr>
-        <w:t xml:space="preserve"> screenutil</w:t>
-      </w:r>
-      <w:r>
-        <w:rPr>
-          <w:rFonts w:ascii="Carlito" w:hAnsi="Carlito" w:cs="Carlito"/>
-          <w:sz w:val="32"/>
-          <w:szCs w:val="32"/>
-        </w:rPr>
-        <w:t xml:space="preserve"> would make our text giant on a 1920px screen. It's not responsive, it's proportional scaling. Those are different things. We use Breakpoints instead, define once, use everywhere</w:t>
-      </w:r>
-    </w:p>
-    <w:p>
-      <w:pPr>
-        <w:jc w:val="both"/>
-        <w:rPr>
-          <w:rFonts w:ascii="Carlito" w:hAnsi="Carlito" w:cs="Carlito"/>
-          <w:b/>
-          <w:bCs/>
-          <w:color w:val="D86DCB" w:themeColor="accent5" w:themeTint="99"/>
-          <w:sz w:val="32"/>
-          <w:szCs w:val="32"/>
-        </w:rPr>
-      </w:pPr>
-      <w:r>
-        <w:rPr>
-          <w:rFonts w:ascii="Carlito" w:hAnsi="Carlito" w:cs="Carlito"/>
-          <w:b/>
-          <w:bCs/>
-          <w:color w:val="D86DCB" w:themeColor="accent5" w:themeTint="99"/>
-          <w:sz w:val="32"/>
-          <w:szCs w:val="32"/>
-        </w:rPr>
-        <w:t>class AppBreakpoints {</w:t>
-      </w:r>
-    </w:p>
-    <w:p>
-      <w:pPr>
-        <w:jc w:val="both"/>
-        <w:rPr>
-          <w:rFonts w:ascii="Carlito" w:hAnsi="Carlito" w:cs="Carlito"/>
-          <w:b/>
-          <w:bCs/>
-          <w:color w:val="D86DCB" w:themeColor="accent5" w:themeTint="99"/>
-          <w:sz w:val="32"/>
-          <w:szCs w:val="32"/>
-        </w:rPr>
-      </w:pPr>
-      <w:r>
-        <w:rPr>
-          <w:rFonts w:ascii="Carlito" w:hAnsi="Carlito" w:cs="Carlito"/>
-          <w:b/>
-          <w:bCs/>
-          <w:color w:val="D86DCB" w:themeColor="accent5" w:themeTint="99"/>
-          <w:sz w:val="32"/>
-          <w:szCs w:val="32"/>
-        </w:rPr>
-        <w:t xml:space="preserve">  static const double mobile = 600;</w:t>
-      </w:r>
-    </w:p>
-    <w:p>
-      <w:pPr>
-        <w:jc w:val="both"/>
-        <w:rPr>
-          <w:rFonts w:ascii="Carlito" w:hAnsi="Carlito" w:cs="Carlito"/>
-          <w:b/>
-          <w:bCs/>
-          <w:color w:val="D86DCB" w:themeColor="accent5" w:themeTint="99"/>
-          <w:sz w:val="32"/>
-          <w:szCs w:val="32"/>
-        </w:rPr>
-      </w:pPr>
-      <w:r>
-        <w:rPr>
-          <w:rFonts w:ascii="Carlito" w:hAnsi="Carlito" w:cs="Carlito"/>
-          <w:b/>
-          <w:bCs/>
-          <w:color w:val="D86DCB" w:themeColor="accent5" w:themeTint="99"/>
-          <w:sz w:val="32"/>
-          <w:szCs w:val="32"/>
-        </w:rPr>
         <w:t xml:space="preserve">  static const double tablet = 1024;</w:t>
       </w:r>
     </w:p>
@@ -9283,7 +9400,6 @@
   <w:style w:type="character" w:default="1" w:styleId="DefaultParagraphFont">
     <w:name w:val="Default Paragraph Font"/>
     <w:uiPriority w:val="1"/>
-    <w:semiHidden/>
     <w:unhideWhenUsed/>
   </w:style>
   <w:style w:type="table" w:default="1" w:styleId="TableNormal">

</xml_diff>